<commit_message>
Stantic indirektni LUT - teorijski + cpp
</commit_message>
<xml_diff>
--- a/Teorijski opisi korišćenih tipova mašina stanja.docx
+++ b/Teorijski opisi korišćenih tipova mašina stanja.docx
@@ -66,6 +66,324 @@
     <w:p>
       <w:pPr>
         <w:rPr>
+          <w:b/>
+          <w:bCs/>
+          <w:sz w:val="36"/>
+          <w:szCs w:val="36"/>
+        </w:rPr>
+      </w:pPr>
+      <w:r>
+        <w:rPr>
+          <w:b/>
+          <w:bCs/>
+          <w:sz w:val="36"/>
+          <w:szCs w:val="36"/>
+        </w:rPr>
+        <w:t xml:space="preserve">1 - </w:t>
+      </w:r>
+      <w:proofErr w:type="spellStart"/>
+      <w:r>
+        <w:rPr>
+          <w:b/>
+          <w:bCs/>
+          <w:sz w:val="36"/>
+          <w:szCs w:val="36"/>
+        </w:rPr>
+        <w:t>Ugneždena</w:t>
+      </w:r>
+      <w:proofErr w:type="spellEnd"/>
+      <w:r>
+        <w:rPr>
+          <w:b/>
+          <w:bCs/>
+          <w:sz w:val="36"/>
+          <w:szCs w:val="36"/>
+        </w:rPr>
+        <w:t xml:space="preserve"> Switch-case FSM </w:t>
+      </w:r>
+    </w:p>
+    <w:p>
+      <w:pPr>
+        <w:rPr>
+          <w:b/>
+          <w:bCs/>
+          <w:sz w:val="36"/>
+          <w:szCs w:val="36"/>
+        </w:rPr>
+      </w:pPr>
+      <w:r>
+        <w:rPr>
+          <w:b/>
+          <w:bCs/>
+          <w:sz w:val="36"/>
+          <w:szCs w:val="36"/>
+        </w:rPr>
+        <w:t xml:space="preserve">2 - </w:t>
+      </w:r>
+      <w:proofErr w:type="spellStart"/>
+      <w:r>
+        <w:rPr>
+          <w:b/>
+          <w:bCs/>
+          <w:sz w:val="36"/>
+          <w:szCs w:val="36"/>
+        </w:rPr>
+        <w:t>Modifikovana</w:t>
+      </w:r>
+      <w:proofErr w:type="spellEnd"/>
+      <w:r>
+        <w:rPr>
+          <w:b/>
+          <w:bCs/>
+          <w:sz w:val="36"/>
+          <w:szCs w:val="36"/>
+        </w:rPr>
+        <w:t xml:space="preserve"> </w:t>
+      </w:r>
+      <w:proofErr w:type="spellStart"/>
+      <w:r>
+        <w:rPr>
+          <w:b/>
+          <w:bCs/>
+          <w:sz w:val="36"/>
+          <w:szCs w:val="36"/>
+        </w:rPr>
+        <w:t>ugneždena</w:t>
+      </w:r>
+      <w:proofErr w:type="spellEnd"/>
+      <w:r>
+        <w:rPr>
+          <w:b/>
+          <w:bCs/>
+          <w:sz w:val="36"/>
+          <w:szCs w:val="36"/>
+        </w:rPr>
+        <w:t xml:space="preserve"> Switch-case FSM </w:t>
+      </w:r>
+    </w:p>
+    <w:p>
+      <w:pPr>
+        <w:rPr>
+          <w:b/>
+          <w:bCs/>
+          <w:sz w:val="36"/>
+          <w:szCs w:val="36"/>
+          <w:lang w:val="de-DE"/>
+        </w:rPr>
+      </w:pPr>
+      <w:r>
+        <w:rPr>
+          <w:b/>
+          <w:bCs/>
+          <w:sz w:val="36"/>
+          <w:szCs w:val="36"/>
+          <w:lang w:val="de-DE"/>
+        </w:rPr>
+        <w:t>3 - FSM strukturnog niza</w:t>
+      </w:r>
+    </w:p>
+    <w:p>
+      <w:pPr>
+        <w:rPr>
+          <w:b/>
+          <w:bCs/>
+          <w:sz w:val="36"/>
+          <w:szCs w:val="36"/>
+          <w:lang w:val="de-DE"/>
+        </w:rPr>
+      </w:pPr>
+      <w:r>
+        <w:rPr>
+          <w:b/>
+          <w:bCs/>
+          <w:sz w:val="36"/>
+          <w:szCs w:val="36"/>
+          <w:lang w:val="de-DE"/>
+        </w:rPr>
+        <w:t>4 - Direktni LUT FSM</w:t>
+      </w:r>
+    </w:p>
+    <w:p>
+      <w:pPr>
+        <w:rPr>
+          <w:b/>
+          <w:bCs/>
+          <w:sz w:val="36"/>
+          <w:szCs w:val="36"/>
+        </w:rPr>
+      </w:pPr>
+      <w:r>
+        <w:rPr>
+          <w:b/>
+          <w:bCs/>
+          <w:sz w:val="36"/>
+          <w:szCs w:val="36"/>
+        </w:rPr>
+        <w:t xml:space="preserve">5 -  FSM </w:t>
+      </w:r>
+      <w:proofErr w:type="spellStart"/>
+      <w:r>
+        <w:rPr>
+          <w:b/>
+          <w:bCs/>
+          <w:sz w:val="36"/>
+          <w:szCs w:val="36"/>
+        </w:rPr>
+        <w:t>objekata</w:t>
+      </w:r>
+      <w:proofErr w:type="spellEnd"/>
+      <w:r>
+        <w:rPr>
+          <w:b/>
+          <w:bCs/>
+          <w:sz w:val="36"/>
+          <w:szCs w:val="36"/>
+        </w:rPr>
+        <w:t xml:space="preserve"> </w:t>
+      </w:r>
+      <w:proofErr w:type="spellStart"/>
+      <w:r>
+        <w:rPr>
+          <w:b/>
+          <w:bCs/>
+          <w:sz w:val="36"/>
+          <w:szCs w:val="36"/>
+        </w:rPr>
+        <w:t>stanja</w:t>
+      </w:r>
+      <w:proofErr w:type="spellEnd"/>
+    </w:p>
+    <w:p>
+      <w:pPr>
+        <w:rPr>
+          <w:b/>
+          <w:bCs/>
+          <w:sz w:val="36"/>
+          <w:szCs w:val="36"/>
+        </w:rPr>
+      </w:pPr>
+      <w:r>
+        <w:rPr>
+          <w:b/>
+          <w:bCs/>
+          <w:sz w:val="36"/>
+          <w:szCs w:val="36"/>
+        </w:rPr>
+        <w:t xml:space="preserve">6 - </w:t>
+      </w:r>
+      <w:proofErr w:type="spellStart"/>
+      <w:r>
+        <w:rPr>
+          <w:b/>
+          <w:bCs/>
+          <w:sz w:val="36"/>
+          <w:szCs w:val="36"/>
+        </w:rPr>
+        <w:t>Planarni</w:t>
+      </w:r>
+      <w:proofErr w:type="spellEnd"/>
+      <w:r>
+        <w:rPr>
+          <w:b/>
+          <w:bCs/>
+          <w:sz w:val="36"/>
+          <w:szCs w:val="36"/>
+        </w:rPr>
+        <w:t xml:space="preserve"> HSM FSM</w:t>
+      </w:r>
+    </w:p>
+    <w:p>
+      <w:pPr>
+        <w:rPr>
+          <w:b/>
+          <w:bCs/>
+          <w:sz w:val="36"/>
+          <w:szCs w:val="36"/>
+        </w:rPr>
+      </w:pPr>
+      <w:r>
+        <w:rPr>
+          <w:b/>
+          <w:bCs/>
+          <w:sz w:val="36"/>
+          <w:szCs w:val="36"/>
+        </w:rPr>
+        <w:t xml:space="preserve">7 - </w:t>
+      </w:r>
+      <w:proofErr w:type="spellStart"/>
+      <w:r>
+        <w:rPr>
+          <w:b/>
+          <w:bCs/>
+          <w:sz w:val="36"/>
+          <w:szCs w:val="36"/>
+        </w:rPr>
+        <w:t>Ugnježdeni</w:t>
+      </w:r>
+      <w:proofErr w:type="spellEnd"/>
+      <w:r>
+        <w:rPr>
+          <w:b/>
+          <w:bCs/>
+          <w:sz w:val="36"/>
+          <w:szCs w:val="36"/>
+        </w:rPr>
+        <w:t xml:space="preserve"> HSM FSM</w:t>
+      </w:r>
+    </w:p>
+    <w:p>
+      <w:pPr>
+        <w:rPr>
+          <w:b/>
+          <w:bCs/>
+          <w:sz w:val="36"/>
+          <w:szCs w:val="36"/>
+        </w:rPr>
+      </w:pPr>
+      <w:r>
+        <w:rPr>
+          <w:b/>
+          <w:bCs/>
+          <w:sz w:val="36"/>
+          <w:szCs w:val="36"/>
+        </w:rPr>
+        <w:t xml:space="preserve">8 - </w:t>
+      </w:r>
+      <w:proofErr w:type="spellStart"/>
+      <w:r>
+        <w:rPr>
+          <w:b/>
+          <w:bCs/>
+          <w:sz w:val="36"/>
+          <w:szCs w:val="36"/>
+        </w:rPr>
+        <w:t>Indirektni</w:t>
+      </w:r>
+      <w:proofErr w:type="spellEnd"/>
+      <w:r>
+        <w:rPr>
+          <w:b/>
+          <w:bCs/>
+          <w:sz w:val="36"/>
+          <w:szCs w:val="36"/>
+        </w:rPr>
+        <w:t xml:space="preserve"> LUT</w:t>
+      </w:r>
+    </w:p>
+    <w:p>
+      <w:pPr>
+        <w:rPr>
+          <w:b/>
+          <w:bCs/>
+          <w:sz w:val="36"/>
+          <w:szCs w:val="36"/>
+          <w:lang w:val="sr-Latn-RS"/>
+        </w:rPr>
+      </w:pPr>
+    </w:p>
+    <w:p>
+      <w:pPr>
+        <w:rPr>
           <w:sz w:val="32"/>
           <w:szCs w:val="32"/>
           <w:lang w:val="sr-Latn-RS"/>
@@ -520,6 +838,7 @@
       </w:r>
       <w:proofErr w:type="spellStart"/>
       <w:r>
+        <w:lastRenderedPageBreak/>
         <w:t>upisuje</w:t>
       </w:r>
       <w:proofErr w:type="spellEnd"/>
@@ -706,7 +1025,7 @@
                     <pic:cNvPicPr/>
                   </pic:nvPicPr>
                   <pic:blipFill>
-                    <a:blip r:embed="rId4"/>
+                    <a:blip r:embed="rId5"/>
                     <a:stretch>
                       <a:fillRect/>
                     </a:stretch>
@@ -763,7 +1082,6 @@
         <w:rPr>
           <w:lang w:val="sr-Latn-RS"/>
         </w:rPr>
-        <w:lastRenderedPageBreak/>
         <w:t>Istu strukturu dispečovanja</w:t>
       </w:r>
       <w:r>
@@ -828,6 +1146,7 @@
           <w:noProof/>
           <w:lang w:val="sr-Latn-RS"/>
         </w:rPr>
+        <w:lastRenderedPageBreak/>
         <w:drawing>
           <wp:inline distT="0" distB="0" distL="0" distR="0" wp14:anchorId="5CCD4F96" wp14:editId="4B731438">
             <wp:extent cx="2533669" cy="4333907"/>
@@ -844,7 +1163,7 @@
                     <pic:cNvPicPr/>
                   </pic:nvPicPr>
                   <pic:blipFill>
-                    <a:blip r:embed="rId5"/>
+                    <a:blip r:embed="rId6"/>
                     <a:stretch>
                       <a:fillRect/>
                     </a:stretch>
@@ -912,7 +1231,7 @@
                     <pic:cNvPicPr/>
                   </pic:nvPicPr>
                   <pic:blipFill>
-                    <a:blip r:embed="rId6"/>
+                    <a:blip r:embed="rId7"/>
                     <a:stretch>
                       <a:fillRect/>
                     </a:stretch>
@@ -1143,15 +1462,7 @@
       </w:r>
       <w:proofErr w:type="spellEnd"/>
       <w:r>
-        <w:t xml:space="preserve">, </w:t>
-      </w:r>
-      <w:proofErr w:type="gramStart"/>
-      <w:r>
-        <w:t>a</w:t>
-      </w:r>
-      <w:proofErr w:type="gramEnd"/>
-      <w:r>
-        <w:t xml:space="preserve"> </w:t>
+        <w:t xml:space="preserve">, a </w:t>
       </w:r>
       <w:proofErr w:type="spellStart"/>
       <w:r>
@@ -1670,7 +1981,7 @@
                     <pic:cNvPicPr/>
                   </pic:nvPicPr>
                   <pic:blipFill>
-                    <a:blip r:embed="rId7"/>
+                    <a:blip r:embed="rId8"/>
                     <a:stretch>
                       <a:fillRect/>
                     </a:stretch>
@@ -1923,13 +2234,8 @@
         <w:t>i</w:t>
       </w:r>
       <w:proofErr w:type="spellEnd"/>
-      <w:proofErr w:type="gramStart"/>
-      <w:r>
-        <w:t>].handler</w:t>
-      </w:r>
-      <w:proofErr w:type="gramEnd"/>
-      <w:r>
-        <w:t xml:space="preserve">()), </w:t>
+      <w:r>
+        <w:t xml:space="preserve">].handler()), </w:t>
       </w:r>
       <w:proofErr w:type="spellStart"/>
       <w:r>
@@ -2621,7 +2927,7 @@
                     <pic:cNvPicPr/>
                   </pic:nvPicPr>
                   <pic:blipFill>
-                    <a:blip r:embed="rId8"/>
+                    <a:blip r:embed="rId9"/>
                     <a:stretch>
                       <a:fillRect/>
                     </a:stretch>
@@ -2726,7 +3032,7 @@
                     <pic:cNvPicPr/>
                   </pic:nvPicPr>
                   <pic:blipFill>
-                    <a:blip r:embed="rId9"/>
+                    <a:blip r:embed="rId10"/>
                     <a:stretch>
                       <a:fillRect/>
                     </a:stretch>
@@ -5255,7 +5561,7 @@
                     <pic:cNvPicPr/>
                   </pic:nvPicPr>
                   <pic:blipFill>
-                    <a:blip r:embed="rId10"/>
+                    <a:blip r:embed="rId11"/>
                     <a:stretch>
                       <a:fillRect/>
                     </a:stretch>
@@ -6130,15 +6436,7 @@
       </w:r>
       <w:proofErr w:type="spellEnd"/>
       <w:r>
-        <w:t xml:space="preserve"> test </w:t>
-      </w:r>
-      <w:proofErr w:type="gramStart"/>
-      <w:r>
-        <w:t>O(</w:t>
-      </w:r>
-      <w:proofErr w:type="gramEnd"/>
-      <w:r>
-        <w:t xml:space="preserve">1) </w:t>
+        <w:t xml:space="preserve"> test O(1) </w:t>
       </w:r>
       <w:proofErr w:type="spellStart"/>
       <w:r>
@@ -6261,7 +6559,7 @@
                     <pic:cNvPicPr/>
                   </pic:nvPicPr>
                   <pic:blipFill>
-                    <a:blip r:embed="rId11"/>
+                    <a:blip r:embed="rId12"/>
                     <a:stretch>
                       <a:fillRect/>
                     </a:stretch>
@@ -7166,23 +7464,7 @@
           <w:i/>
           <w:iCs/>
         </w:rPr>
-        <w:t xml:space="preserve">"Good performance — </w:t>
-      </w:r>
-      <w:proofErr w:type="gramStart"/>
-      <w:r>
-        <w:rPr>
-          <w:i/>
-          <w:iCs/>
-        </w:rPr>
-        <w:t>O(</w:t>
-      </w:r>
-      <w:proofErr w:type="gramEnd"/>
-      <w:r>
-        <w:rPr>
-          <w:i/>
-          <w:iCs/>
-        </w:rPr>
-        <w:t>log n), where n is the number of cases in the switch statement"</w:t>
+        <w:t>"Good performance — O(log n), where n is the number of cases in the switch statement"</w:t>
       </w:r>
       <w:r>
         <w:t xml:space="preserve"> — </w:t>
@@ -7622,7 +7904,7 @@
                     <pic:cNvPicPr/>
                   </pic:nvPicPr>
                   <pic:blipFill>
-                    <a:blip r:embed="rId12"/>
+                    <a:blip r:embed="rId13"/>
                     <a:stretch>
                       <a:fillRect/>
                     </a:stretch>
@@ -7750,577 +8032,85 @@
           <w:lang w:val="sr-Latn-RS"/>
         </w:rPr>
       </w:pPr>
-      <w:proofErr w:type="spellStart"/>
-      <w:r>
-        <w:t>Grananje</w:t>
-      </w:r>
-      <w:proofErr w:type="spellEnd"/>
-      <w:r>
-        <w:t xml:space="preserve"> po </w:t>
-      </w:r>
-      <w:proofErr w:type="spellStart"/>
-      <w:r>
-        <w:t>događaju</w:t>
-      </w:r>
-      <w:proofErr w:type="spellEnd"/>
-      <w:r>
-        <w:t xml:space="preserve">, za </w:t>
-      </w:r>
-      <w:proofErr w:type="spellStart"/>
-      <w:r>
-        <w:t>razliku</w:t>
-      </w:r>
-      <w:proofErr w:type="spellEnd"/>
-      <w:r>
-        <w:t xml:space="preserve"> od </w:t>
-      </w:r>
-      <w:proofErr w:type="spellStart"/>
-      <w:r>
-        <w:t>izbora</w:t>
-      </w:r>
-      <w:proofErr w:type="spellEnd"/>
-      <w:r>
-        <w:t xml:space="preserve"> </w:t>
-      </w:r>
-      <w:proofErr w:type="spellStart"/>
-      <w:r>
-        <w:t>stanja</w:t>
-      </w:r>
-      <w:proofErr w:type="spellEnd"/>
-      <w:r>
-        <w:t xml:space="preserve">, ne </w:t>
-      </w:r>
-      <w:proofErr w:type="spellStart"/>
-      <w:r>
-        <w:t>dešava</w:t>
-      </w:r>
-      <w:proofErr w:type="spellEnd"/>
-      <w:r>
-        <w:t xml:space="preserve"> se u </w:t>
-      </w:r>
-      <w:proofErr w:type="spellStart"/>
-      <w:r>
-        <w:t>fsm_</w:t>
-      </w:r>
-      <w:proofErr w:type="gramStart"/>
-      <w:r>
-        <w:t>transition</w:t>
-      </w:r>
-      <w:proofErr w:type="spellEnd"/>
-      <w:r>
-        <w:t>(</w:t>
-      </w:r>
-      <w:proofErr w:type="gramEnd"/>
-      <w:r>
-        <w:t xml:space="preserve">), </w:t>
-      </w:r>
-      <w:proofErr w:type="spellStart"/>
-      <w:r>
+      <w:r>
+        <w:rPr>
+          <w:lang w:val="sr-Latn-RS"/>
+        </w:rPr>
+        <w:t xml:space="preserve">Grananje po događaju, za razliku od izbora stanja, ne dešava se u fsm_transition(), </w:t>
+      </w:r>
+      <w:r>
+        <w:rPr>
+          <w:lang w:val="sr-Latn-RS"/>
+        </w:rPr>
         <w:t>nego</w:t>
       </w:r>
-      <w:proofErr w:type="spellEnd"/>
-      <w:r>
-        <w:t xml:space="preserve"> </w:t>
-      </w:r>
-      <w:proofErr w:type="spellStart"/>
-      <w:r>
-        <w:t>unutar</w:t>
-      </w:r>
-      <w:proofErr w:type="spellEnd"/>
-      <w:r>
-        <w:t xml:space="preserve"> </w:t>
-      </w:r>
-      <w:proofErr w:type="spellStart"/>
-      <w:r>
-        <w:t>svakog</w:t>
-      </w:r>
-      <w:proofErr w:type="spellEnd"/>
-      <w:r>
-        <w:t xml:space="preserve"> </w:t>
-      </w:r>
-      <w:proofErr w:type="spellStart"/>
-      <w:r>
-        <w:t>pojedinačnog</w:t>
-      </w:r>
-      <w:proofErr w:type="spellEnd"/>
-      <w:r>
-        <w:t xml:space="preserve"> </w:t>
-      </w:r>
-      <w:proofErr w:type="spellStart"/>
-      <w:r>
-        <w:t>handlera</w:t>
-      </w:r>
-      <w:proofErr w:type="spellEnd"/>
-      <w:r>
-        <w:t xml:space="preserve"> — </w:t>
-      </w:r>
-      <w:proofErr w:type="spellStart"/>
-      <w:r>
-        <w:t>na</w:t>
-      </w:r>
-      <w:proofErr w:type="spellEnd"/>
-      <w:r>
-        <w:t xml:space="preserve"> primer, </w:t>
-      </w:r>
-      <w:proofErr w:type="spellStart"/>
-      <w:r>
-        <w:t>state_checking_handle</w:t>
-      </w:r>
-      <w:proofErr w:type="spellEnd"/>
-      <w:r>
-        <w:t xml:space="preserve"> </w:t>
-      </w:r>
-      <w:proofErr w:type="spellStart"/>
-      <w:r>
-        <w:t>sadrži</w:t>
-      </w:r>
-      <w:proofErr w:type="spellEnd"/>
-      <w:r>
-        <w:t xml:space="preserve"> </w:t>
-      </w:r>
-      <w:proofErr w:type="spellStart"/>
-      <w:r>
-        <w:t>niz</w:t>
-      </w:r>
-      <w:proofErr w:type="spellEnd"/>
-      <w:r>
-        <w:t xml:space="preserve"> od </w:t>
-      </w:r>
-      <w:proofErr w:type="spellStart"/>
-      <w:r>
-        <w:t>dve</w:t>
-      </w:r>
-      <w:proofErr w:type="spellEnd"/>
-      <w:r>
-        <w:t xml:space="preserve"> do tri if </w:t>
-      </w:r>
-      <w:proofErr w:type="spellStart"/>
-      <w:r>
-        <w:t>provere</w:t>
-      </w:r>
-      <w:proofErr w:type="spellEnd"/>
-      <w:r>
-        <w:t xml:space="preserve"> </w:t>
-      </w:r>
-      <w:proofErr w:type="spellStart"/>
-      <w:r>
-        <w:t>kojima</w:t>
-      </w:r>
-      <w:proofErr w:type="spellEnd"/>
-      <w:r>
-        <w:t xml:space="preserve"> se </w:t>
-      </w:r>
-      <w:proofErr w:type="spellStart"/>
-      <w:r>
-        <w:t>ispituje</w:t>
-      </w:r>
-      <w:proofErr w:type="spellEnd"/>
-      <w:r>
-        <w:t xml:space="preserve"> koji je </w:t>
-      </w:r>
-      <w:proofErr w:type="spellStart"/>
-      <w:r>
-        <w:t>konkretno</w:t>
-      </w:r>
-      <w:proofErr w:type="spellEnd"/>
-      <w:r>
-        <w:t xml:space="preserve"> </w:t>
-      </w:r>
-      <w:proofErr w:type="spellStart"/>
-      <w:r>
-        <w:t>događaj</w:t>
-      </w:r>
-      <w:proofErr w:type="spellEnd"/>
-      <w:r>
-        <w:t xml:space="preserve"> </w:t>
-      </w:r>
-      <w:proofErr w:type="spellStart"/>
-      <w:r>
-        <w:t>stigao</w:t>
-      </w:r>
-      <w:proofErr w:type="spellEnd"/>
-      <w:r>
-        <w:t xml:space="preserve">, </w:t>
-      </w:r>
-      <w:proofErr w:type="spellStart"/>
-      <w:r>
-        <w:t>budući</w:t>
-      </w:r>
-      <w:proofErr w:type="spellEnd"/>
-      <w:r>
-        <w:t xml:space="preserve"> da je </w:t>
-      </w:r>
-      <w:proofErr w:type="spellStart"/>
-      <w:r>
-        <w:t>stanje</w:t>
-      </w:r>
-      <w:proofErr w:type="spellEnd"/>
-      <w:r>
-        <w:t xml:space="preserve"> (a time </w:t>
-      </w:r>
-      <w:proofErr w:type="spellStart"/>
-      <w:r>
-        <w:t>i</w:t>
-      </w:r>
-      <w:proofErr w:type="spellEnd"/>
-      <w:r>
-        <w:t xml:space="preserve"> koji </w:t>
-      </w:r>
-      <w:proofErr w:type="spellStart"/>
-      <w:r>
-        <w:t>će</w:t>
-      </w:r>
-      <w:proofErr w:type="spellEnd"/>
-      <w:r>
-        <w:t xml:space="preserve"> se handler </w:t>
-      </w:r>
-      <w:proofErr w:type="spellStart"/>
-      <w:r>
-        <w:t>pozvati</w:t>
-      </w:r>
-      <w:proofErr w:type="spellEnd"/>
-      <w:r>
-        <w:t xml:space="preserve">) </w:t>
-      </w:r>
-      <w:proofErr w:type="spellStart"/>
-      <w:r>
-        <w:t>već</w:t>
-      </w:r>
-      <w:proofErr w:type="spellEnd"/>
-      <w:r>
-        <w:t xml:space="preserve"> </w:t>
-      </w:r>
-      <w:proofErr w:type="spellStart"/>
-      <w:r>
-        <w:t>određeno</w:t>
-      </w:r>
-      <w:proofErr w:type="spellEnd"/>
-      <w:r>
-        <w:t xml:space="preserve"> pre </w:t>
-      </w:r>
-      <w:proofErr w:type="spellStart"/>
-      <w:r>
-        <w:t>samog</w:t>
-      </w:r>
-      <w:proofErr w:type="spellEnd"/>
-      <w:r>
-        <w:t xml:space="preserve"> </w:t>
-      </w:r>
-      <w:proofErr w:type="spellStart"/>
-      <w:r>
-        <w:t>poziva</w:t>
-      </w:r>
-      <w:proofErr w:type="spellEnd"/>
-      <w:r>
-        <w:t xml:space="preserve">. </w:t>
-      </w:r>
-      <w:r>
+      <w:r>
+        <w:rPr>
+          <w:lang w:val="sr-Latn-RS"/>
+        </w:rPr>
+        <w:t xml:space="preserve"> unutar svakog pojedinačnog handlera — na primer, state_checking_handle sadrži niz od dve do tri if provere kojima se ispituje koji je konkretno događaj stigao, budući da je stanje (a time i koji će se handler pozvati) već određeno pre samog poziva. </w:t>
+      </w:r>
+      <w:r>
+        <w:rPr>
+          <w:lang w:val="sr-Latn-RS"/>
+        </w:rPr>
         <w:t>N</w:t>
       </w:r>
       <w:r>
-        <w:t xml:space="preserve">a taj </w:t>
-      </w:r>
-      <w:proofErr w:type="spellStart"/>
-      <w:r>
-        <w:t>unutrašnji</w:t>
-      </w:r>
-      <w:proofErr w:type="spellEnd"/>
-      <w:r>
-        <w:t xml:space="preserve"> </w:t>
-      </w:r>
-      <w:proofErr w:type="spellStart"/>
-      <w:r>
-        <w:t>broj</w:t>
-      </w:r>
-      <w:proofErr w:type="spellEnd"/>
-      <w:r>
-        <w:t xml:space="preserve"> grana </w:t>
-      </w:r>
-      <w:proofErr w:type="spellStart"/>
-      <w:r>
-        <w:t>odnosi</w:t>
-      </w:r>
-      <w:proofErr w:type="spellEnd"/>
-      <w:r>
-        <w:t xml:space="preserve"> </w:t>
-      </w:r>
-      <w:r>
+        <w:rPr>
+          <w:lang w:val="sr-Latn-RS"/>
+        </w:rPr>
+        <w:t xml:space="preserve">a taj unutrašnji broj grana odnosi </w:t>
+      </w:r>
+      <w:r>
+        <w:rPr>
+          <w:lang w:val="sr-Latn-RS"/>
+        </w:rPr>
         <w:t xml:space="preserve">se </w:t>
       </w:r>
-      <w:proofErr w:type="spellStart"/>
-      <w:r>
-        <w:t>Adamczykova</w:t>
-      </w:r>
-      <w:proofErr w:type="spellEnd"/>
-      <w:r>
-        <w:t xml:space="preserve"> </w:t>
-      </w:r>
-      <w:proofErr w:type="spellStart"/>
-      <w:r>
-        <w:t>ocena</w:t>
-      </w:r>
-      <w:proofErr w:type="spellEnd"/>
-      <w:r>
-        <w:t xml:space="preserve"> </w:t>
-      </w:r>
-      <w:proofErr w:type="gramStart"/>
-      <w:r>
-        <w:t>O(</w:t>
-      </w:r>
-      <w:proofErr w:type="gramEnd"/>
-      <w:r>
-        <w:t>log n)/O(n)</w:t>
-      </w:r>
-      <w:r>
+      <w:r>
+        <w:rPr>
+          <w:lang w:val="sr-Latn-RS"/>
+        </w:rPr>
+        <w:t>Adamczykova ocena O(log n)/O(n)</w:t>
+      </w:r>
+      <w:r>
+        <w:rPr>
+          <w:lang w:val="sr-Latn-RS"/>
+        </w:rPr>
         <w:t>.</w:t>
       </w:r>
       <w:r>
-        <w:t xml:space="preserve"> </w:t>
-      </w:r>
-      <w:r>
+        <w:rPr>
+          <w:lang w:val="sr-Latn-RS"/>
+        </w:rPr>
+        <w:t xml:space="preserve"> </w:t>
+      </w:r>
+      <w:r>
+        <w:rPr>
+          <w:lang w:val="sr-Latn-RS"/>
+        </w:rPr>
         <w:t>C</w:t>
       </w:r>
       <w:r>
-        <w:t xml:space="preserve">ena </w:t>
-      </w:r>
-      <w:proofErr w:type="spellStart"/>
-      <w:r>
-        <w:t>tranzicije</w:t>
-      </w:r>
-      <w:proofErr w:type="spellEnd"/>
-      <w:r>
-        <w:t xml:space="preserve"> </w:t>
-      </w:r>
-      <w:proofErr w:type="spellStart"/>
-      <w:r>
-        <w:t>zavisi</w:t>
-      </w:r>
-      <w:proofErr w:type="spellEnd"/>
-      <w:r>
-        <w:t xml:space="preserve"> od toga </w:t>
-      </w:r>
-      <w:proofErr w:type="spellStart"/>
-      <w:r>
-        <w:t>koliko</w:t>
-      </w:r>
-      <w:proofErr w:type="spellEnd"/>
-      <w:r>
-        <w:t xml:space="preserve"> </w:t>
-      </w:r>
-      <w:proofErr w:type="spellStart"/>
-      <w:r>
-        <w:t>provera</w:t>
-      </w:r>
-      <w:proofErr w:type="spellEnd"/>
-      <w:r>
-        <w:t xml:space="preserve"> </w:t>
-      </w:r>
-      <w:proofErr w:type="spellStart"/>
-      <w:r>
-        <w:t>treba</w:t>
-      </w:r>
-      <w:proofErr w:type="spellEnd"/>
-      <w:r>
-        <w:t xml:space="preserve"> </w:t>
-      </w:r>
-      <w:proofErr w:type="spellStart"/>
-      <w:r>
-        <w:t>izvršiti</w:t>
-      </w:r>
-      <w:proofErr w:type="spellEnd"/>
-      <w:r>
-        <w:t xml:space="preserve"> </w:t>
-      </w:r>
-      <w:proofErr w:type="spellStart"/>
-      <w:r>
-        <w:t>unutar</w:t>
-      </w:r>
-      <w:proofErr w:type="spellEnd"/>
-      <w:r>
-        <w:t xml:space="preserve"> </w:t>
-      </w:r>
-      <w:proofErr w:type="spellStart"/>
-      <w:r>
-        <w:t>handlera</w:t>
-      </w:r>
-      <w:proofErr w:type="spellEnd"/>
-      <w:r>
-        <w:t xml:space="preserve"> </w:t>
-      </w:r>
-      <w:proofErr w:type="spellStart"/>
-      <w:r>
-        <w:t>dok</w:t>
-      </w:r>
-      <w:proofErr w:type="spellEnd"/>
-      <w:r>
-        <w:t xml:space="preserve"> se ne </w:t>
-      </w:r>
-      <w:proofErr w:type="spellStart"/>
-      <w:r>
-        <w:t>pronađe</w:t>
-      </w:r>
-      <w:proofErr w:type="spellEnd"/>
-      <w:r>
-        <w:t xml:space="preserve"> </w:t>
-      </w:r>
-      <w:proofErr w:type="spellStart"/>
-      <w:r>
-        <w:t>poklapanje</w:t>
-      </w:r>
-      <w:proofErr w:type="spellEnd"/>
-      <w:r>
-        <w:t xml:space="preserve"> </w:t>
-      </w:r>
-      <w:proofErr w:type="spellStart"/>
-      <w:r>
-        <w:t>sa</w:t>
-      </w:r>
-      <w:proofErr w:type="spellEnd"/>
-      <w:r>
-        <w:t xml:space="preserve"> </w:t>
-      </w:r>
-      <w:proofErr w:type="spellStart"/>
-      <w:r>
-        <w:t>pristiglim</w:t>
-      </w:r>
-      <w:proofErr w:type="spellEnd"/>
-      <w:r>
-        <w:t xml:space="preserve"> </w:t>
-      </w:r>
-      <w:proofErr w:type="spellStart"/>
-      <w:r>
-        <w:t>događajem</w:t>
-      </w:r>
-      <w:proofErr w:type="spellEnd"/>
-      <w:r>
-        <w:t xml:space="preserve">. Ovo </w:t>
-      </w:r>
-      <w:proofErr w:type="spellStart"/>
-      <w:r>
-        <w:t>direktno</w:t>
-      </w:r>
-      <w:proofErr w:type="spellEnd"/>
-      <w:r>
-        <w:t xml:space="preserve"> </w:t>
-      </w:r>
-      <w:proofErr w:type="spellStart"/>
-      <w:r>
-        <w:t>objašnjava</w:t>
-      </w:r>
-      <w:proofErr w:type="spellEnd"/>
-      <w:r>
-        <w:t xml:space="preserve"> </w:t>
-      </w:r>
-      <w:proofErr w:type="spellStart"/>
-      <w:r>
-        <w:t>zašto</w:t>
-      </w:r>
-      <w:proofErr w:type="spellEnd"/>
-      <w:r>
-        <w:t xml:space="preserve"> je State Object </w:t>
-      </w:r>
-      <w:proofErr w:type="spellStart"/>
-      <w:r>
-        <w:t>implementacija</w:t>
-      </w:r>
-      <w:proofErr w:type="spellEnd"/>
-      <w:r>
-        <w:t xml:space="preserve"> u </w:t>
-      </w:r>
-      <w:proofErr w:type="spellStart"/>
-      <w:r>
-        <w:t>merenjima</w:t>
-      </w:r>
-      <w:proofErr w:type="spellEnd"/>
-      <w:r>
-        <w:t xml:space="preserve"> </w:t>
-      </w:r>
-      <w:proofErr w:type="spellStart"/>
-      <w:r>
-        <w:t>ovog</w:t>
-      </w:r>
-      <w:proofErr w:type="spellEnd"/>
-      <w:r>
-        <w:t xml:space="preserve"> rada </w:t>
-      </w:r>
-      <w:proofErr w:type="spellStart"/>
-      <w:r>
-        <w:t>sporija</w:t>
-      </w:r>
-      <w:proofErr w:type="spellEnd"/>
-      <w:r>
-        <w:t xml:space="preserve"> od </w:t>
-      </w:r>
-      <w:proofErr w:type="spellStart"/>
-      <w:r>
-        <w:t>implementacije</w:t>
-      </w:r>
-      <w:proofErr w:type="spellEnd"/>
-      <w:r>
-        <w:t xml:space="preserve"> Indexed Table (26 </w:t>
-      </w:r>
-      <w:proofErr w:type="spellStart"/>
-      <w:r>
-        <w:t>naspram</w:t>
-      </w:r>
-      <w:proofErr w:type="spellEnd"/>
-      <w:r>
-        <w:t xml:space="preserve"> 17 </w:t>
-      </w:r>
-      <w:proofErr w:type="spellStart"/>
-      <w:r>
-        <w:t>ciklusa</w:t>
-      </w:r>
-      <w:proofErr w:type="spellEnd"/>
-      <w:r>
-        <w:t xml:space="preserve"> </w:t>
-      </w:r>
-      <w:proofErr w:type="spellStart"/>
-      <w:r>
-        <w:t>na</w:t>
-      </w:r>
-      <w:proofErr w:type="spellEnd"/>
-      <w:r>
-        <w:t xml:space="preserve"> AVR </w:t>
-      </w:r>
-      <w:proofErr w:type="spellStart"/>
-      <w:r>
-        <w:t>platformi</w:t>
-      </w:r>
-      <w:proofErr w:type="spellEnd"/>
-      <w:r>
-        <w:t xml:space="preserve">) </w:t>
-      </w:r>
-      <w:proofErr w:type="spellStart"/>
-      <w:r>
-        <w:t>uprkos</w:t>
-      </w:r>
-      <w:proofErr w:type="spellEnd"/>
-      <w:r>
-        <w:t xml:space="preserve"> </w:t>
-      </w:r>
-      <w:proofErr w:type="spellStart"/>
-      <w:r>
-        <w:t>manjem</w:t>
-      </w:r>
-      <w:proofErr w:type="spellEnd"/>
-      <w:r>
-        <w:t xml:space="preserve"> </w:t>
-      </w:r>
-      <w:proofErr w:type="spellStart"/>
-      <w:r>
+        <w:rPr>
+          <w:lang w:val="sr-Latn-RS"/>
+        </w:rPr>
+        <w:t xml:space="preserve">ena tranzicije zavisi od toga koliko provera treba izvršiti unutar handlera dok se ne pronađe poklapanje sa pristiglim događajem. Ovo direktno objašnjava zašto je State Object implementacija u merenjima ovog rada sporija od implementacije Indexed Table (26 naspram 17 ciklusa na AVR platformi) uprkos manjem </w:t>
+      </w:r>
+      <w:r>
+        <w:rPr>
+          <w:lang w:val="sr-Latn-RS"/>
+        </w:rPr>
         <w:lastRenderedPageBreak/>
-        <w:t>memorijskom</w:t>
-      </w:r>
-      <w:proofErr w:type="spellEnd"/>
-      <w:r>
-        <w:t xml:space="preserve"> </w:t>
-      </w:r>
-      <w:proofErr w:type="spellStart"/>
-      <w:r>
+        <w:t xml:space="preserve">memorijskom </w:t>
+      </w:r>
+      <w:r>
+        <w:rPr>
+          <w:lang w:val="sr-Latn-RS"/>
+        </w:rPr>
         <w:t>zauze</w:t>
       </w:r>
-      <w:proofErr w:type="spellEnd"/>
       <w:r>
         <w:rPr>
           <w:lang w:val="sr-Latn-RS"/>
@@ -10498,16 +10288,11 @@
         <w:t>koristi</w:t>
       </w:r>
       <w:proofErr w:type="spellEnd"/>
-      <w:proofErr w:type="gramStart"/>
       <w:r>
         <w:t xml:space="preserve">) </w:t>
       </w:r>
       <w:r>
-        <w:t>.</w:t>
-      </w:r>
-      <w:proofErr w:type="gramEnd"/>
-      <w:r>
-        <w:t xml:space="preserve"> </w:t>
+        <w:t xml:space="preserve">. </w:t>
       </w:r>
       <w:r>
         <w:t xml:space="preserve">HSM flat/nested </w:t>
@@ -10817,7 +10602,6 @@
         <w:t xml:space="preserve">se </w:t>
       </w:r>
       <w:proofErr w:type="spellStart"/>
-      <w:proofErr w:type="gramStart"/>
       <w:r>
         <w:t>dešava</w:t>
       </w:r>
@@ -10830,7 +10614,6 @@
         <w:t>pri</w:t>
       </w:r>
       <w:proofErr w:type="spellEnd"/>
-      <w:proofErr w:type="gramEnd"/>
       <w:r>
         <w:t xml:space="preserve"> </w:t>
       </w:r>
@@ -11032,15 +10815,7 @@
       </w:r>
       <w:proofErr w:type="spellEnd"/>
       <w:r>
-        <w:t xml:space="preserve"> automata (node = state). Ako handler </w:t>
-      </w:r>
-      <w:proofErr w:type="gramStart"/>
-      <w:r>
-        <w:t>tog</w:t>
-      </w:r>
-      <w:proofErr w:type="gramEnd"/>
-      <w:r>
-        <w:t xml:space="preserve"> </w:t>
+        <w:t xml:space="preserve"> automata (node = state). Ako handler tog </w:t>
       </w:r>
       <w:proofErr w:type="spellStart"/>
       <w:r>
@@ -11072,15 +10847,7 @@
       </w:r>
       <w:proofErr w:type="spellEnd"/>
       <w:r>
-        <w:t xml:space="preserve"> </w:t>
-      </w:r>
-      <w:proofErr w:type="spellStart"/>
-      <w:r>
-        <w:t>na</w:t>
-      </w:r>
-      <w:proofErr w:type="spellEnd"/>
-      <w:r>
-        <w:t xml:space="preserve"> </w:t>
+        <w:t xml:space="preserve"> na </w:t>
       </w:r>
       <w:proofErr w:type="spellStart"/>
       <w:r>
@@ -11104,13 +10871,8 @@
       </w:r>
       <w:proofErr w:type="spellEnd"/>
       <w:r>
-        <w:t>[node</w:t>
-      </w:r>
-      <w:proofErr w:type="gramStart"/>
-      <w:r>
-        <w:t>].parent</w:t>
-      </w:r>
-      <w:proofErr w:type="gramEnd"/>
+        <w:t>[node].parent</w:t>
+      </w:r>
       <w:r>
         <w:t xml:space="preserve"> </w:t>
       </w:r>
@@ -11154,7 +10916,15 @@
         <w:t>Slici 10</w:t>
       </w:r>
       <w:r>
-        <w:t xml:space="preserve">), i </w:t>
+        <w:t xml:space="preserve">), </w:t>
+      </w:r>
+      <w:proofErr w:type="spellStart"/>
+      <w:r>
+        <w:t>i</w:t>
+      </w:r>
+      <w:proofErr w:type="spellEnd"/>
+      <w:r>
+        <w:t xml:space="preserve"> </w:t>
       </w:r>
       <w:proofErr w:type="spellStart"/>
       <w:r>
@@ -11226,19 +10996,11 @@
       </w:r>
       <w:proofErr w:type="spellStart"/>
       <w:r>
-        <w:t>fsm_</w:t>
-      </w:r>
-      <w:proofErr w:type="gramStart"/>
-      <w:r>
-        <w:t>transition</w:t>
-      </w:r>
-      <w:proofErr w:type="spellEnd"/>
-      <w:r>
-        <w:t>(</w:t>
-      </w:r>
-      <w:proofErr w:type="gramEnd"/>
-      <w:r>
-        <w:t xml:space="preserve">) — node se </w:t>
+        <w:t>fsm_transition</w:t>
+      </w:r>
+      <w:proofErr w:type="spellEnd"/>
+      <w:r>
+        <w:t xml:space="preserve">() — node se </w:t>
       </w:r>
       <w:proofErr w:type="spellStart"/>
       <w:r>
@@ -11355,6 +11117,9 @@
     </w:p>
     <w:p>
       <w:r>
+        <w:rPr>
+          <w:noProof/>
+        </w:rPr>
         <w:lastRenderedPageBreak/>
         <w:drawing>
           <wp:inline distT="0" distB="0" distL="0" distR="0" wp14:anchorId="1F8830F6" wp14:editId="46CB1081">
@@ -11372,7 +11137,7 @@
                     <pic:cNvPicPr/>
                   </pic:nvPicPr>
                   <pic:blipFill>
-                    <a:blip r:embed="rId13"/>
+                    <a:blip r:embed="rId14"/>
                     <a:stretch>
                       <a:fillRect/>
                     </a:stretch>
@@ -11739,7 +11504,7 @@
                     <pic:cNvPicPr/>
                   </pic:nvPicPr>
                   <pic:blipFill>
-                    <a:blip r:embed="rId14"/>
+                    <a:blip r:embed="rId15"/>
                     <a:stretch>
                       <a:fillRect/>
                     </a:stretch>
@@ -11867,15 +11632,7 @@
       </w:r>
       <w:proofErr w:type="spellEnd"/>
       <w:r>
-        <w:t xml:space="preserve"> (while (</w:t>
-      </w:r>
-      <w:proofErr w:type="gramStart"/>
-      <w:r>
-        <w:t>node !</w:t>
-      </w:r>
-      <w:proofErr w:type="gramEnd"/>
-      <w:r>
-        <w:t xml:space="preserve">= -1)) se u </w:t>
+        <w:t xml:space="preserve"> (while (node != -1)) se u </w:t>
       </w:r>
       <w:proofErr w:type="spellStart"/>
       <w:r>
@@ -12141,7 +11898,6 @@
         <w:t xml:space="preserve"> </w:t>
       </w:r>
       <w:proofErr w:type="spellStart"/>
-      <w:proofErr w:type="gramStart"/>
       <w:r>
         <w:t>vrednosti</w:t>
       </w:r>
@@ -12153,11 +11909,7 @@
         <w:t>,</w:t>
       </w:r>
       <w:r>
-        <w:t>u</w:t>
-      </w:r>
-      <w:proofErr w:type="gramEnd"/>
-      <w:r>
-        <w:t xml:space="preserve"> </w:t>
+        <w:t xml:space="preserve">u </w:t>
       </w:r>
       <w:proofErr w:type="spellStart"/>
       <w:r>
@@ -12288,7 +12040,6 @@
         <w:t xml:space="preserve"> </w:t>
       </w:r>
       <w:proofErr w:type="spellStart"/>
-      <w:proofErr w:type="gramStart"/>
       <w:r>
         <w:t>probubljavanja</w:t>
       </w:r>
@@ -12296,7 +12047,6 @@
       <w:r>
         <w:t>(</w:t>
       </w:r>
-      <w:proofErr w:type="gramEnd"/>
       <w:r>
         <w:t>event bubbling</w:t>
       </w:r>
@@ -13344,15 +13094,7 @@
       </w:r>
       <w:proofErr w:type="spellEnd"/>
       <w:r>
-        <w:t xml:space="preserve">, </w:t>
-      </w:r>
-      <w:proofErr w:type="gramStart"/>
-      <w:r>
-        <w:t>a</w:t>
-      </w:r>
-      <w:proofErr w:type="gramEnd"/>
-      <w:r>
-        <w:t xml:space="preserve"> </w:t>
+        <w:t xml:space="preserve">, a </w:t>
       </w:r>
       <w:proofErr w:type="spellStart"/>
       <w:r>
@@ -13416,7 +13158,7 @@
                     <pic:cNvPicPr/>
                   </pic:nvPicPr>
                   <pic:blipFill>
-                    <a:blip r:embed="rId15"/>
+                    <a:blip r:embed="rId16"/>
                     <a:stretch>
                       <a:fillRect/>
                     </a:stretch>
@@ -13469,6 +13211,2975 @@
         <w:t>2</w:t>
       </w:r>
     </w:p>
+    <w:p>
+      <w:pPr>
+        <w:rPr>
+          <w:b/>
+          <w:bCs/>
+          <w:sz w:val="32"/>
+          <w:szCs w:val="32"/>
+          <w:lang w:val="sr-Latn-RS"/>
+        </w:rPr>
+      </w:pPr>
+      <w:proofErr w:type="spellStart"/>
+      <w:r>
+        <w:rPr>
+          <w:b/>
+          <w:bCs/>
+          <w:sz w:val="32"/>
+          <w:szCs w:val="32"/>
+        </w:rPr>
+        <w:t>Indirektni</w:t>
+      </w:r>
+      <w:proofErr w:type="spellEnd"/>
+      <w:r>
+        <w:rPr>
+          <w:b/>
+          <w:bCs/>
+          <w:sz w:val="32"/>
+          <w:szCs w:val="32"/>
+        </w:rPr>
+        <w:t xml:space="preserve"> LUT FSM</w:t>
+      </w:r>
+      <w:r>
+        <w:rPr>
+          <w:b/>
+          <w:bCs/>
+          <w:sz w:val="32"/>
+          <w:szCs w:val="32"/>
+        </w:rPr>
+        <w:t xml:space="preserve"> – </w:t>
+      </w:r>
+      <w:proofErr w:type="spellStart"/>
+      <w:r>
+        <w:rPr>
+          <w:b/>
+          <w:bCs/>
+          <w:sz w:val="32"/>
+          <w:szCs w:val="32"/>
+        </w:rPr>
+        <w:t>Stanti</w:t>
+      </w:r>
+      <w:proofErr w:type="spellEnd"/>
+      <w:r>
+        <w:rPr>
+          <w:b/>
+          <w:bCs/>
+          <w:sz w:val="32"/>
+          <w:szCs w:val="32"/>
+          <w:lang w:val="sr-Latn-RS"/>
+        </w:rPr>
+        <w:t>ć</w:t>
+      </w:r>
+    </w:p>
+    <w:p>
+      <w:pPr>
+        <w:rPr>
+          <w:lang w:val="sr-Latn-RS"/>
+        </w:rPr>
+      </w:pPr>
+      <w:r>
+        <w:rPr>
+          <w:lang w:val="sr-Latn-RS"/>
+        </w:rPr>
+        <w:t>Za razliku od ostalih izvora u ovom radu</w:t>
+      </w:r>
+      <w:r>
+        <w:rPr>
+          <w:lang w:val="sr-Latn-RS"/>
+        </w:rPr>
+        <w:t xml:space="preserve">, </w:t>
+      </w:r>
+      <w:r>
+        <w:rPr>
+          <w:lang w:val="sr-Latn-RS"/>
+        </w:rPr>
+        <w:t xml:space="preserve">ovaj pristup potiče iz praktičnog, inženjerskog članka namenjenog embedded programerima — Santic, </w:t>
+      </w:r>
+      <w:r>
+        <w:rPr>
+          <w:i/>
+          <w:iCs/>
+          <w:lang w:val="sr-Latn-RS"/>
+        </w:rPr>
+        <w:t>"Writing Efficient State Machines in C"</w:t>
+      </w:r>
+      <w:r>
+        <w:rPr>
+          <w:lang w:val="sr-Latn-RS"/>
+        </w:rPr>
+        <w:t xml:space="preserve"> (johnsantic.com/comp/state.html). Autor eksplicitno postavlja dva načina implementacije FSM-a u C-u: ugnježđeni switch iskazi (koje naziva jednim od dva uobičajena načina) i tabelu pretrage (lookup table), koju karakteriše kao koncizniji</w:t>
+      </w:r>
+      <w:r>
+        <w:rPr>
+          <w:lang w:val="sr-Latn-RS"/>
+        </w:rPr>
+        <w:t xml:space="preserve"> </w:t>
+      </w:r>
+      <w:r>
+        <w:rPr>
+          <w:lang w:val="sr-Latn-RS"/>
+        </w:rPr>
+        <w:t xml:space="preserve">pristup. </w:t>
+      </w:r>
+      <w:r>
+        <w:rPr>
+          <w:lang w:val="sr-Latn-RS"/>
+        </w:rPr>
+        <w:br/>
+      </w:r>
+      <w:r>
+        <w:rPr>
+          <w:lang w:val="sr-Latn-RS"/>
+        </w:rPr>
+        <w:t>K</w:t>
+      </w:r>
+      <w:r>
+        <w:rPr>
+          <w:lang w:val="sr-Latn-RS"/>
+        </w:rPr>
+        <w:t xml:space="preserve">orišćeni Stantićev mehanizam obuhvata: </w:t>
+      </w:r>
+    </w:p>
+    <w:p>
+      <w:pPr>
+        <w:pStyle w:val="ListParagraph"/>
+        <w:numPr>
+          <w:ilvl w:val="0"/>
+          <w:numId w:val="1"/>
+        </w:numPr>
+        <w:rPr>
+          <w:lang w:val="sr-Latn-RS"/>
+        </w:rPr>
+      </w:pPr>
+      <w:r>
+        <w:rPr>
+          <w:lang w:val="sr-Latn-RS"/>
+        </w:rPr>
+        <w:t>N</w:t>
+      </w:r>
+      <w:r>
+        <w:rPr>
+          <w:lang w:val="sr-Latn-RS"/>
+        </w:rPr>
+        <w:t>abr</w:t>
+      </w:r>
+      <w:r>
+        <w:rPr>
+          <w:lang w:val="sr-Latn-RS"/>
+        </w:rPr>
+        <w:t>ajanje</w:t>
+      </w:r>
+      <w:r>
+        <w:rPr>
+          <w:lang w:val="sr-Latn-RS"/>
+        </w:rPr>
+        <w:t xml:space="preserve"> sv</w:t>
+      </w:r>
+      <w:r>
+        <w:rPr>
+          <w:lang w:val="sr-Latn-RS"/>
+        </w:rPr>
+        <w:t>ih</w:t>
+      </w:r>
+      <w:r>
+        <w:rPr>
+          <w:lang w:val="sr-Latn-RS"/>
+        </w:rPr>
+        <w:t xml:space="preserve"> stanja i događaj</w:t>
+      </w:r>
+      <w:r>
+        <w:rPr>
+          <w:lang w:val="sr-Latn-RS"/>
+        </w:rPr>
+        <w:t>a</w:t>
+      </w:r>
+      <w:r>
+        <w:rPr>
+          <w:lang w:val="sr-Latn-RS"/>
+        </w:rPr>
+        <w:t xml:space="preserve"> </w:t>
+      </w:r>
+      <w:r>
+        <w:rPr>
+          <w:lang w:val="sr-Latn-RS"/>
+        </w:rPr>
+        <w:t>u enumerisanom tipu podataka</w:t>
+      </w:r>
+      <w:r>
+        <w:rPr>
+          <w:lang w:val="sr-Latn-RS"/>
+        </w:rPr>
+        <w:t>.</w:t>
+      </w:r>
+    </w:p>
+    <w:p>
+      <w:pPr>
+        <w:pStyle w:val="ListParagraph"/>
+        <w:numPr>
+          <w:ilvl w:val="0"/>
+          <w:numId w:val="1"/>
+        </w:numPr>
+        <w:rPr>
+          <w:lang w:val="sr-Latn-RS"/>
+        </w:rPr>
+      </w:pPr>
+      <w:r>
+        <w:rPr>
+          <w:lang w:val="sr-Latn-RS"/>
+        </w:rPr>
+        <w:t xml:space="preserve"> </w:t>
+      </w:r>
+      <w:r>
+        <w:rPr>
+          <w:lang w:val="sr-Latn-RS"/>
+        </w:rPr>
+        <w:t>K</w:t>
+      </w:r>
+      <w:r>
+        <w:rPr>
+          <w:lang w:val="sr-Latn-RS"/>
+        </w:rPr>
+        <w:t>reiranje</w:t>
+      </w:r>
+      <w:r>
+        <w:rPr>
+          <w:lang w:val="sr-Latn-RS"/>
+        </w:rPr>
+        <w:t xml:space="preserve"> s</w:t>
+      </w:r>
+      <w:r>
+        <w:rPr>
+          <w:lang w:val="sr-Latn-RS"/>
+        </w:rPr>
+        <w:t>kupa tabela</w:t>
+      </w:r>
+      <w:r>
+        <w:rPr>
+          <w:lang w:val="sr-Latn-RS"/>
+        </w:rPr>
+        <w:t xml:space="preserve">, </w:t>
+      </w:r>
+      <w:r>
+        <w:rPr>
+          <w:lang w:val="sr-Latn-RS"/>
+        </w:rPr>
+        <w:t>jedn</w:t>
+      </w:r>
+      <w:r>
+        <w:rPr>
+          <w:lang w:val="sr-Latn-RS"/>
+        </w:rPr>
+        <w:t xml:space="preserve">a </w:t>
+      </w:r>
+      <w:r>
+        <w:rPr>
+          <w:lang w:val="sr-Latn-RS"/>
+        </w:rPr>
+        <w:t>po stanju</w:t>
+      </w:r>
+      <w:r>
+        <w:rPr>
+          <w:lang w:val="sr-Latn-RS"/>
+        </w:rPr>
+        <w:t xml:space="preserve">, </w:t>
+      </w:r>
+      <w:r>
+        <w:rPr>
+          <w:lang w:val="sr-Latn-RS"/>
+        </w:rPr>
+        <w:t>gde svaki unos predstavlja funkciju koja se izvršava za taj par (stanje, događaj)</w:t>
+      </w:r>
+      <w:r>
+        <w:rPr>
+          <w:lang w:val="sr-Latn-RS"/>
+        </w:rPr>
+        <w:t>.</w:t>
+      </w:r>
+    </w:p>
+    <w:p>
+      <w:pPr>
+        <w:pStyle w:val="ListParagraph"/>
+        <w:numPr>
+          <w:ilvl w:val="0"/>
+          <w:numId w:val="1"/>
+        </w:numPr>
+        <w:rPr>
+          <w:lang w:val="sr-Latn-RS"/>
+        </w:rPr>
+      </w:pPr>
+      <w:r>
+        <w:rPr>
+          <w:lang w:val="sr-Latn-RS"/>
+        </w:rPr>
+        <w:t xml:space="preserve"> </w:t>
+      </w:r>
+      <w:r>
+        <w:rPr>
+          <w:lang w:val="sr-Latn-RS"/>
+        </w:rPr>
+        <w:t>Postavljanje elemenata</w:t>
+      </w:r>
+      <w:r>
+        <w:rPr>
+          <w:lang w:val="sr-Latn-RS"/>
+        </w:rPr>
+        <w:t xml:space="preserve"> tabele u jedinstven dvodimenzioni niz indeksiran stanjem i događajem.</w:t>
+      </w:r>
+    </w:p>
+    <w:p>
+      <w:r>
+        <w:rPr>
+          <w:lang w:val="sr-Latn-RS"/>
+        </w:rPr>
+        <w:t>K</w:t>
+      </w:r>
+      <w:r>
+        <w:rPr>
+          <w:lang w:val="sr-Latn-RS"/>
+        </w:rPr>
+        <w:t>ljučna razlika u odnosu na ostale implementacije sa pokazivačima na funkcije</w:t>
+      </w:r>
+      <w:r>
+        <w:rPr>
+          <w:lang w:val="sr-Latn-RS"/>
+        </w:rPr>
+        <w:t xml:space="preserve"> je što </w:t>
+      </w:r>
+      <w:r>
+        <w:rPr>
+          <w:lang w:val="sr-Latn-RS"/>
+        </w:rPr>
+        <w:t xml:space="preserve"> Santi</w:t>
+      </w:r>
+      <w:r>
+        <w:rPr>
+          <w:lang w:val="sr-Latn-RS"/>
+        </w:rPr>
+        <w:t xml:space="preserve">ćeve </w:t>
+      </w:r>
+      <w:r>
+        <w:rPr>
+          <w:lang w:val="sr-Latn-RS"/>
+        </w:rPr>
+        <w:t>akci</w:t>
+      </w:r>
+      <w:r>
+        <w:rPr>
+          <w:lang w:val="sr-Latn-RS"/>
+        </w:rPr>
+        <w:t xml:space="preserve">one </w:t>
+      </w:r>
+      <w:r>
+        <w:rPr>
+          <w:lang w:val="sr-Latn-RS"/>
+        </w:rPr>
+        <w:t>procedure tipa void</w:t>
+      </w:r>
+      <w:r>
+        <w:rPr>
+          <w:lang w:val="sr-Latn-RS"/>
+        </w:rPr>
+        <w:t xml:space="preserve"> nemaju</w:t>
+      </w:r>
+      <w:r>
+        <w:rPr>
+          <w:lang w:val="sr-Latn-RS"/>
+        </w:rPr>
+        <w:t xml:space="preserve"> povratn</w:t>
+      </w:r>
+      <w:r>
+        <w:rPr>
+          <w:lang w:val="sr-Latn-RS"/>
+        </w:rPr>
+        <w:t>u</w:t>
+      </w:r>
+      <w:r>
+        <w:rPr>
+          <w:lang w:val="sr-Latn-RS"/>
+        </w:rPr>
+        <w:t xml:space="preserve"> vrednost</w:t>
+      </w:r>
+      <w:r>
+        <w:rPr>
+          <w:lang w:val="sr-Latn-RS"/>
+        </w:rPr>
+        <w:t>.</w:t>
+      </w:r>
+      <w:r>
+        <w:rPr>
+          <w:lang w:val="sr-Latn-RS"/>
+        </w:rPr>
+        <w:t xml:space="preserve"> </w:t>
+      </w:r>
+      <w:r>
+        <w:rPr>
+          <w:lang w:val="sr-Latn-RS"/>
+        </w:rPr>
+        <w:t>U</w:t>
+      </w:r>
+      <w:r>
+        <w:rPr>
+          <w:lang w:val="sr-Latn-RS"/>
+        </w:rPr>
+        <w:t xml:space="preserve">mesto da tranzicija bude izražena kroz ono što funkcija vrati, ona se izražava kroz ono što funkcija uradi kao sporedni efekat: </w:t>
+      </w:r>
+      <w:r>
+        <w:rPr>
+          <w:i/>
+          <w:iCs/>
+          <w:lang w:val="sr-Latn-RS"/>
+        </w:rPr>
+        <w:t xml:space="preserve">"In an action procedure, you do whatever processing is required for the particular event in the particular state. </w:t>
+      </w:r>
+      <w:r>
+        <w:rPr>
+          <w:i/>
+          <w:iCs/>
+        </w:rPr>
+        <w:t>Among other things, you might have to set a new state."</w:t>
+      </w:r>
+      <w:r>
+        <w:t xml:space="preserve"> </w:t>
+      </w:r>
+      <w:r>
+        <w:t xml:space="preserve">. </w:t>
+      </w:r>
+    </w:p>
+    <w:p/>
+    <w:p>
+      <w:pPr>
+        <w:jc w:val="center"/>
+        <w:rPr>
+          <w:i/>
+          <w:iCs/>
+        </w:rPr>
+      </w:pPr>
+      <w:r>
+        <w:lastRenderedPageBreak/>
+        <w:drawing>
+          <wp:inline distT="0" distB="0" distL="0" distR="0" wp14:anchorId="6C0D3977" wp14:editId="526274DB">
+            <wp:extent cx="5343564" cy="1171584"/>
+            <wp:effectExtent l="0" t="0" r="0" b="9525"/>
+            <wp:docPr id="863247077" name="Picture 1"/>
+            <wp:cNvGraphicFramePr>
+              <a:graphicFrameLocks xmlns:a="http://schemas.openxmlformats.org/drawingml/2006/main" noChangeAspect="1"/>
+            </wp:cNvGraphicFramePr>
+            <a:graphic xmlns:a="http://schemas.openxmlformats.org/drawingml/2006/main">
+              <a:graphicData uri="http://schemas.openxmlformats.org/drawingml/2006/picture">
+                <pic:pic xmlns:pic="http://schemas.openxmlformats.org/drawingml/2006/picture">
+                  <pic:nvPicPr>
+                    <pic:cNvPr id="863247077" name=""/>
+                    <pic:cNvPicPr/>
+                  </pic:nvPicPr>
+                  <pic:blipFill>
+                    <a:blip r:embed="rId17"/>
+                    <a:stretch>
+                      <a:fillRect/>
+                    </a:stretch>
+                  </pic:blipFill>
+                  <pic:spPr>
+                    <a:xfrm>
+                      <a:off x="0" y="0"/>
+                      <a:ext cx="5343564" cy="1171584"/>
+                    </a:xfrm>
+                    <a:prstGeom prst="rect">
+                      <a:avLst/>
+                    </a:prstGeom>
+                  </pic:spPr>
+                </pic:pic>
+              </a:graphicData>
+            </a:graphic>
+          </wp:inline>
+        </w:drawing>
+      </w:r>
+    </w:p>
+    <w:p>
+      <w:pPr>
+        <w:jc w:val="center"/>
+        <w:rPr>
+          <w:i/>
+          <w:iCs/>
+        </w:rPr>
+      </w:pPr>
+      <w:r>
+        <w:br/>
+      </w:r>
+      <w:proofErr w:type="spellStart"/>
+      <w:r>
+        <w:rPr>
+          <w:i/>
+          <w:iCs/>
+        </w:rPr>
+        <w:t>Slika</w:t>
+      </w:r>
+      <w:proofErr w:type="spellEnd"/>
+      <w:r>
+        <w:rPr>
+          <w:i/>
+          <w:iCs/>
+        </w:rPr>
+        <w:t xml:space="preserve"> 1</w:t>
+      </w:r>
+      <w:r>
+        <w:rPr>
+          <w:i/>
+          <w:iCs/>
+        </w:rPr>
+        <w:t xml:space="preserve">3 – Stantić </w:t>
+      </w:r>
+      <w:proofErr w:type="spellStart"/>
+      <w:r>
+        <w:rPr>
+          <w:i/>
+          <w:iCs/>
+        </w:rPr>
+        <w:t>akciona</w:t>
+      </w:r>
+      <w:proofErr w:type="spellEnd"/>
+      <w:r>
+        <w:rPr>
+          <w:i/>
+          <w:iCs/>
+        </w:rPr>
+        <w:t xml:space="preserve"> </w:t>
+      </w:r>
+      <w:proofErr w:type="spellStart"/>
+      <w:r>
+        <w:rPr>
+          <w:i/>
+          <w:iCs/>
+        </w:rPr>
+        <w:t>procedura</w:t>
+      </w:r>
+      <w:proofErr w:type="spellEnd"/>
+      <w:r>
+        <w:rPr>
+          <w:i/>
+          <w:iCs/>
+        </w:rPr>
+        <w:t xml:space="preserve"> bez </w:t>
+      </w:r>
+      <w:proofErr w:type="spellStart"/>
+      <w:r>
+        <w:rPr>
+          <w:i/>
+          <w:iCs/>
+        </w:rPr>
+        <w:t>povratne</w:t>
+      </w:r>
+      <w:proofErr w:type="spellEnd"/>
+      <w:r>
+        <w:rPr>
+          <w:i/>
+          <w:iCs/>
+        </w:rPr>
+        <w:t xml:space="preserve"> </w:t>
+      </w:r>
+      <w:proofErr w:type="spellStart"/>
+      <w:r>
+        <w:rPr>
+          <w:i/>
+          <w:iCs/>
+        </w:rPr>
+        <w:t>vrednosti</w:t>
+      </w:r>
+      <w:proofErr w:type="spellEnd"/>
+    </w:p>
+    <w:p>
+      <w:r>
+        <w:br/>
+      </w:r>
+      <w:proofErr w:type="spellStart"/>
+      <w:r>
+        <w:t>Konkretno</w:t>
+      </w:r>
+      <w:proofErr w:type="spellEnd"/>
+      <w:r>
+        <w:t xml:space="preserve">, </w:t>
+      </w:r>
+      <w:proofErr w:type="spellStart"/>
+      <w:r>
+        <w:t>akci</w:t>
+      </w:r>
+      <w:r>
+        <w:t>ona</w:t>
+      </w:r>
+      <w:proofErr w:type="spellEnd"/>
+      <w:r>
+        <w:t xml:space="preserve"> </w:t>
+      </w:r>
+      <w:proofErr w:type="spellStart"/>
+      <w:r>
+        <w:t>procedura</w:t>
+      </w:r>
+      <w:proofErr w:type="spellEnd"/>
+      <w:r>
+        <w:t xml:space="preserve"> </w:t>
+      </w:r>
+      <w:proofErr w:type="spellStart"/>
+      <w:r>
+        <w:t>sama</w:t>
+      </w:r>
+      <w:proofErr w:type="spellEnd"/>
+      <w:r>
+        <w:t xml:space="preserve">, </w:t>
+      </w:r>
+      <w:proofErr w:type="spellStart"/>
+      <w:r>
+        <w:t>unutar</w:t>
+      </w:r>
+      <w:proofErr w:type="spellEnd"/>
+      <w:r>
+        <w:t xml:space="preserve"> </w:t>
+      </w:r>
+      <w:proofErr w:type="spellStart"/>
+      <w:r>
+        <w:t>tela</w:t>
+      </w:r>
+      <w:proofErr w:type="spellEnd"/>
+      <w:r>
+        <w:t xml:space="preserve"> </w:t>
+      </w:r>
+      <w:proofErr w:type="spellStart"/>
+      <w:r>
+        <w:t>funkcije</w:t>
+      </w:r>
+      <w:proofErr w:type="spellEnd"/>
+      <w:r>
+        <w:t xml:space="preserve">, </w:t>
+      </w:r>
+      <w:proofErr w:type="spellStart"/>
+      <w:r>
+        <w:t>upisuje</w:t>
+      </w:r>
+      <w:proofErr w:type="spellEnd"/>
+      <w:r>
+        <w:t xml:space="preserve"> novo </w:t>
+      </w:r>
+      <w:proofErr w:type="spellStart"/>
+      <w:r>
+        <w:t>stanje</w:t>
+      </w:r>
+      <w:proofErr w:type="spellEnd"/>
+      <w:r>
+        <w:t xml:space="preserve"> u </w:t>
+      </w:r>
+      <w:proofErr w:type="spellStart"/>
+      <w:r>
+        <w:t>globalnu</w:t>
+      </w:r>
+      <w:proofErr w:type="spellEnd"/>
+      <w:r>
+        <w:t xml:space="preserve"> </w:t>
+      </w:r>
+      <w:proofErr w:type="spellStart"/>
+      <w:r>
+        <w:t>promenljivu</w:t>
+      </w:r>
+      <w:proofErr w:type="spellEnd"/>
+      <w:r>
+        <w:t xml:space="preserve"> (</w:t>
+      </w:r>
+      <w:proofErr w:type="spellStart"/>
+      <w:r>
+        <w:t>current_state</w:t>
+      </w:r>
+      <w:proofErr w:type="spellEnd"/>
+      <w:r>
+        <w:t xml:space="preserve"> = STATE_2;)</w:t>
+      </w:r>
+      <w:r>
+        <w:t xml:space="preserve">, </w:t>
+      </w:r>
+      <w:proofErr w:type="spellStart"/>
+      <w:r>
+        <w:t>kao</w:t>
+      </w:r>
+      <w:proofErr w:type="spellEnd"/>
+      <w:r>
+        <w:t xml:space="preserve"> </w:t>
+      </w:r>
+      <w:proofErr w:type="spellStart"/>
+      <w:r>
+        <w:t>što</w:t>
+      </w:r>
+      <w:proofErr w:type="spellEnd"/>
+      <w:r>
+        <w:t xml:space="preserve"> je </w:t>
+      </w:r>
+      <w:proofErr w:type="spellStart"/>
+      <w:r>
+        <w:t>prikazano</w:t>
+      </w:r>
+      <w:proofErr w:type="spellEnd"/>
+      <w:r>
+        <w:t xml:space="preserve"> </w:t>
+      </w:r>
+      <w:proofErr w:type="spellStart"/>
+      <w:r>
+        <w:t>na</w:t>
+      </w:r>
+      <w:proofErr w:type="spellEnd"/>
+      <w:r>
+        <w:t xml:space="preserve"> </w:t>
+      </w:r>
+      <w:r>
+        <w:rPr>
+          <w:i/>
+          <w:iCs/>
+        </w:rPr>
+        <w:t>Slici 13</w:t>
+      </w:r>
+      <w:r>
+        <w:t xml:space="preserve">, za </w:t>
+      </w:r>
+      <w:proofErr w:type="spellStart"/>
+      <w:r>
+        <w:t>razliku</w:t>
+      </w:r>
+      <w:proofErr w:type="spellEnd"/>
+      <w:r>
+        <w:t xml:space="preserve"> od </w:t>
+      </w:r>
+      <w:proofErr w:type="spellStart"/>
+      <w:r>
+        <w:t>implementacije</w:t>
+      </w:r>
+      <w:proofErr w:type="spellEnd"/>
+      <w:r>
+        <w:t xml:space="preserve"> </w:t>
+      </w:r>
+      <w:proofErr w:type="spellStart"/>
+      <w:r>
+        <w:t>sa</w:t>
+      </w:r>
+      <w:proofErr w:type="spellEnd"/>
+      <w:r>
+        <w:t xml:space="preserve"> </w:t>
+      </w:r>
+      <w:proofErr w:type="spellStart"/>
+      <w:r>
+        <w:t>pokazivačima</w:t>
+      </w:r>
+      <w:proofErr w:type="spellEnd"/>
+      <w:r>
+        <w:t xml:space="preserve"> </w:t>
+      </w:r>
+      <w:proofErr w:type="spellStart"/>
+      <w:r>
+        <w:t>funkcija</w:t>
+      </w:r>
+      <w:proofErr w:type="spellEnd"/>
+      <w:r>
+        <w:t xml:space="preserve"> </w:t>
+      </w:r>
+      <w:proofErr w:type="spellStart"/>
+      <w:r>
+        <w:t>zasnovane</w:t>
+      </w:r>
+      <w:proofErr w:type="spellEnd"/>
+      <w:r>
+        <w:t xml:space="preserve"> </w:t>
+      </w:r>
+      <w:proofErr w:type="spellStart"/>
+      <w:r>
+        <w:t>na</w:t>
+      </w:r>
+      <w:proofErr w:type="spellEnd"/>
+      <w:r>
+        <w:t xml:space="preserve"> </w:t>
+      </w:r>
+      <w:r>
+        <w:t xml:space="preserve">Carlgren </w:t>
+      </w:r>
+      <w:proofErr w:type="spellStart"/>
+      <w:r>
+        <w:t>i</w:t>
+      </w:r>
+      <w:proofErr w:type="spellEnd"/>
+      <w:r>
+        <w:t xml:space="preserve"> Oskarsson</w:t>
+      </w:r>
+      <w:r>
+        <w:t xml:space="preserve"> </w:t>
+      </w:r>
+      <w:proofErr w:type="spellStart"/>
+      <w:r>
+        <w:t>radu</w:t>
+      </w:r>
+      <w:proofErr w:type="spellEnd"/>
+      <w:r>
+        <w:t xml:space="preserve">, </w:t>
+      </w:r>
+      <w:proofErr w:type="spellStart"/>
+      <w:r>
+        <w:t>gde</w:t>
+      </w:r>
+      <w:proofErr w:type="spellEnd"/>
+      <w:r>
+        <w:t xml:space="preserve"> handler </w:t>
+      </w:r>
+      <w:proofErr w:type="spellStart"/>
+      <w:r>
+        <w:t>vraća</w:t>
+      </w:r>
+      <w:proofErr w:type="spellEnd"/>
+      <w:r>
+        <w:t xml:space="preserve"> </w:t>
+      </w:r>
+      <w:proofErr w:type="spellStart"/>
+      <w:r>
+        <w:t>sledeće</w:t>
+      </w:r>
+      <w:proofErr w:type="spellEnd"/>
+      <w:r>
+        <w:t xml:space="preserve"> </w:t>
+      </w:r>
+      <w:proofErr w:type="spellStart"/>
+      <w:r>
+        <w:t>stanje</w:t>
+      </w:r>
+      <w:proofErr w:type="spellEnd"/>
+      <w:r>
+        <w:t xml:space="preserve">, a </w:t>
+      </w:r>
+      <w:proofErr w:type="spellStart"/>
+      <w:r>
+        <w:t>upis</w:t>
+      </w:r>
+      <w:proofErr w:type="spellEnd"/>
+      <w:r>
+        <w:t xml:space="preserve"> </w:t>
+      </w:r>
+      <w:proofErr w:type="spellStart"/>
+      <w:r>
+        <w:t>obavlja</w:t>
+      </w:r>
+      <w:proofErr w:type="spellEnd"/>
+      <w:r>
+        <w:t xml:space="preserve"> </w:t>
+      </w:r>
+      <w:proofErr w:type="spellStart"/>
+      <w:r>
+        <w:t>pozivalac</w:t>
+      </w:r>
+      <w:proofErr w:type="spellEnd"/>
+      <w:r>
+        <w:t xml:space="preserve"> </w:t>
+      </w:r>
+      <w:proofErr w:type="spellStart"/>
+      <w:r>
+        <w:t>spolja</w:t>
+      </w:r>
+      <w:proofErr w:type="spellEnd"/>
+      <w:r>
+        <w:t xml:space="preserve"> (</w:t>
+      </w:r>
+      <w:proofErr w:type="spellStart"/>
+      <w:r>
+        <w:rPr>
+          <w:i/>
+          <w:iCs/>
+        </w:rPr>
+        <w:t>Slika</w:t>
+      </w:r>
+      <w:proofErr w:type="spellEnd"/>
+      <w:r>
+        <w:rPr>
+          <w:i/>
+          <w:iCs/>
+        </w:rPr>
+        <w:t xml:space="preserve"> </w:t>
+      </w:r>
+      <w:r>
+        <w:rPr>
+          <w:i/>
+          <w:iCs/>
+        </w:rPr>
+        <w:t>7</w:t>
+      </w:r>
+      <w:r>
+        <w:t>)</w:t>
+      </w:r>
+      <w:r>
+        <w:t xml:space="preserve">. </w:t>
+      </w:r>
+      <w:r>
+        <w:br/>
+      </w:r>
+      <w:proofErr w:type="spellStart"/>
+      <w:r>
+        <w:t>Broj</w:t>
+      </w:r>
+      <w:proofErr w:type="spellEnd"/>
+      <w:r>
+        <w:t xml:space="preserve"> </w:t>
+      </w:r>
+      <w:proofErr w:type="spellStart"/>
+      <w:r>
+        <w:t>indirektnih</w:t>
+      </w:r>
+      <w:proofErr w:type="spellEnd"/>
+      <w:r>
+        <w:t xml:space="preserve"> </w:t>
+      </w:r>
+      <w:proofErr w:type="spellStart"/>
+      <w:r>
+        <w:t>poziva</w:t>
+      </w:r>
+      <w:proofErr w:type="spellEnd"/>
+      <w:r>
+        <w:t xml:space="preserve"> </w:t>
+      </w:r>
+      <w:proofErr w:type="spellStart"/>
+      <w:r>
+        <w:t>funkcije</w:t>
+      </w:r>
+      <w:proofErr w:type="spellEnd"/>
+      <w:r>
+        <w:t xml:space="preserve"> je </w:t>
+      </w:r>
+      <w:proofErr w:type="spellStart"/>
+      <w:r>
+        <w:t>identičan</w:t>
+      </w:r>
+      <w:proofErr w:type="spellEnd"/>
+      <w:r>
+        <w:t xml:space="preserve"> u oba </w:t>
+      </w:r>
+      <w:proofErr w:type="spellStart"/>
+      <w:r>
+        <w:t>pristupa</w:t>
+      </w:r>
+      <w:proofErr w:type="spellEnd"/>
+      <w:r>
+        <w:t xml:space="preserve"> (</w:t>
+      </w:r>
+      <w:proofErr w:type="spellStart"/>
+      <w:r>
+        <w:t>tačno</w:t>
+      </w:r>
+      <w:proofErr w:type="spellEnd"/>
+      <w:r>
+        <w:t xml:space="preserve"> </w:t>
+      </w:r>
+      <w:proofErr w:type="spellStart"/>
+      <w:r>
+        <w:t>jedan</w:t>
+      </w:r>
+      <w:proofErr w:type="spellEnd"/>
+      <w:r>
+        <w:t xml:space="preserve"> po </w:t>
+      </w:r>
+      <w:proofErr w:type="spellStart"/>
+      <w:r>
+        <w:t>tranziciji</w:t>
+      </w:r>
+      <w:proofErr w:type="spellEnd"/>
+      <w:r>
+        <w:t xml:space="preserve">) — </w:t>
+      </w:r>
+      <w:proofErr w:type="spellStart"/>
+      <w:r>
+        <w:t>razlikuje</w:t>
+      </w:r>
+      <w:proofErr w:type="spellEnd"/>
+      <w:r>
+        <w:t xml:space="preserve"> se </w:t>
+      </w:r>
+      <w:proofErr w:type="spellStart"/>
+      <w:r>
+        <w:t>samo</w:t>
+      </w:r>
+      <w:proofErr w:type="spellEnd"/>
+      <w:r>
+        <w:t xml:space="preserve"> </w:t>
+      </w:r>
+      <w:proofErr w:type="spellStart"/>
+      <w:r>
+        <w:t>mehanizam</w:t>
+      </w:r>
+      <w:proofErr w:type="spellEnd"/>
+      <w:r>
+        <w:t xml:space="preserve"> </w:t>
+      </w:r>
+      <w:proofErr w:type="spellStart"/>
+      <w:r>
+        <w:t>prenosa</w:t>
+      </w:r>
+      <w:proofErr w:type="spellEnd"/>
+      <w:r>
+        <w:t xml:space="preserve"> </w:t>
+      </w:r>
+      <w:proofErr w:type="spellStart"/>
+      <w:r>
+        <w:t>rezultata</w:t>
+      </w:r>
+      <w:proofErr w:type="spellEnd"/>
+      <w:r>
+        <w:t xml:space="preserve"> (return </w:t>
+      </w:r>
+      <w:proofErr w:type="spellStart"/>
+      <w:r>
+        <w:t>vrednost</w:t>
+      </w:r>
+      <w:proofErr w:type="spellEnd"/>
+      <w:r>
+        <w:t xml:space="preserve"> </w:t>
+      </w:r>
+      <w:proofErr w:type="spellStart"/>
+      <w:r>
+        <w:t>naspram</w:t>
+      </w:r>
+      <w:proofErr w:type="spellEnd"/>
+      <w:r>
+        <w:t xml:space="preserve"> </w:t>
+      </w:r>
+      <w:proofErr w:type="spellStart"/>
+      <w:r>
+        <w:t>direktnog</w:t>
+      </w:r>
+      <w:proofErr w:type="spellEnd"/>
+      <w:r>
+        <w:t xml:space="preserve"> </w:t>
+      </w:r>
+      <w:proofErr w:type="spellStart"/>
+      <w:r>
+        <w:t>upisa</w:t>
+      </w:r>
+      <w:proofErr w:type="spellEnd"/>
+      <w:r>
+        <w:t xml:space="preserve"> </w:t>
+      </w:r>
+      <w:proofErr w:type="spellStart"/>
+      <w:r>
+        <w:t>deljene</w:t>
+      </w:r>
+      <w:proofErr w:type="spellEnd"/>
+      <w:r>
+        <w:t xml:space="preserve"> </w:t>
+      </w:r>
+      <w:proofErr w:type="spellStart"/>
+      <w:r>
+        <w:t>promenljive</w:t>
+      </w:r>
+      <w:proofErr w:type="spellEnd"/>
+      <w:r>
+        <w:t xml:space="preserve"> </w:t>
+      </w:r>
+      <w:proofErr w:type="spellStart"/>
+      <w:r>
+        <w:t>iznutra</w:t>
+      </w:r>
+      <w:proofErr w:type="spellEnd"/>
+      <w:r>
+        <w:t>)</w:t>
+      </w:r>
+      <w:r>
+        <w:t>.</w:t>
+      </w:r>
+    </w:p>
+    <w:p>
+      <w:r>
+        <w:t xml:space="preserve">Za </w:t>
+      </w:r>
+      <w:proofErr w:type="spellStart"/>
+      <w:r>
+        <w:t>razliku</w:t>
+      </w:r>
+      <w:proofErr w:type="spellEnd"/>
+      <w:r>
+        <w:t xml:space="preserve"> od </w:t>
+      </w:r>
+      <w:proofErr w:type="spellStart"/>
+      <w:r>
+        <w:t>Adamczyka</w:t>
+      </w:r>
+      <w:proofErr w:type="spellEnd"/>
+      <w:r>
+        <w:t xml:space="preserve"> </w:t>
+      </w:r>
+      <w:proofErr w:type="spellStart"/>
+      <w:r>
+        <w:t>i</w:t>
+      </w:r>
+      <w:proofErr w:type="spellEnd"/>
+      <w:r>
+        <w:t xml:space="preserve"> Carlgren-</w:t>
+      </w:r>
+      <w:proofErr w:type="spellStart"/>
+      <w:r>
+        <w:t>Oskarssona</w:t>
+      </w:r>
+      <w:proofErr w:type="spellEnd"/>
+      <w:r>
+        <w:t xml:space="preserve">, koji se </w:t>
+      </w:r>
+      <w:proofErr w:type="spellStart"/>
+      <w:r>
+        <w:t>fokusiraju</w:t>
+      </w:r>
+      <w:proofErr w:type="spellEnd"/>
+      <w:r>
+        <w:t xml:space="preserve"> </w:t>
+      </w:r>
+      <w:proofErr w:type="spellStart"/>
+      <w:r>
+        <w:t>na</w:t>
+      </w:r>
+      <w:proofErr w:type="spellEnd"/>
+      <w:r>
+        <w:t xml:space="preserve"> </w:t>
+      </w:r>
+      <w:proofErr w:type="spellStart"/>
+      <w:r>
+        <w:t>performanse</w:t>
+      </w:r>
+      <w:proofErr w:type="spellEnd"/>
+      <w:r>
+        <w:t xml:space="preserve"> </w:t>
+      </w:r>
+      <w:proofErr w:type="spellStart"/>
+      <w:r>
+        <w:t>i</w:t>
+      </w:r>
+      <w:proofErr w:type="spellEnd"/>
+      <w:r>
+        <w:t xml:space="preserve"> </w:t>
+      </w:r>
+      <w:proofErr w:type="spellStart"/>
+      <w:r>
+        <w:t>arhitekturu</w:t>
+      </w:r>
+      <w:proofErr w:type="spellEnd"/>
+      <w:r>
+        <w:t xml:space="preserve">, </w:t>
+      </w:r>
+      <w:proofErr w:type="spellStart"/>
+      <w:r>
+        <w:t>Santi</w:t>
+      </w:r>
+      <w:r>
+        <w:t>ć</w:t>
+      </w:r>
+      <w:proofErr w:type="spellEnd"/>
+      <w:r>
+        <w:t xml:space="preserve"> </w:t>
+      </w:r>
+      <w:proofErr w:type="spellStart"/>
+      <w:r>
+        <w:t>eksplicitno</w:t>
+      </w:r>
+      <w:proofErr w:type="spellEnd"/>
+      <w:r>
+        <w:t xml:space="preserve"> </w:t>
+      </w:r>
+      <w:proofErr w:type="spellStart"/>
+      <w:r>
+        <w:t>upozorava</w:t>
+      </w:r>
+      <w:proofErr w:type="spellEnd"/>
+      <w:r>
+        <w:t xml:space="preserve"> </w:t>
+      </w:r>
+      <w:proofErr w:type="spellStart"/>
+      <w:r>
+        <w:t>na</w:t>
+      </w:r>
+      <w:proofErr w:type="spellEnd"/>
+      <w:r>
+        <w:t xml:space="preserve"> </w:t>
+      </w:r>
+      <w:proofErr w:type="spellStart"/>
+      <w:r>
+        <w:t>bezbednosni</w:t>
+      </w:r>
+      <w:proofErr w:type="spellEnd"/>
+      <w:r>
+        <w:t xml:space="preserve"> </w:t>
+      </w:r>
+      <w:proofErr w:type="spellStart"/>
+      <w:r>
+        <w:t>rizik</w:t>
+      </w:r>
+      <w:proofErr w:type="spellEnd"/>
+      <w:r>
+        <w:t xml:space="preserve"> </w:t>
+      </w:r>
+      <w:proofErr w:type="spellStart"/>
+      <w:r>
+        <w:t>specifičan</w:t>
+      </w:r>
+      <w:proofErr w:type="spellEnd"/>
+      <w:r>
+        <w:t xml:space="preserve"> za </w:t>
+      </w:r>
+      <w:proofErr w:type="spellStart"/>
+      <w:r>
+        <w:t>tabelarne</w:t>
+      </w:r>
+      <w:proofErr w:type="spellEnd"/>
+      <w:r>
+        <w:t xml:space="preserve"> </w:t>
+      </w:r>
+      <w:proofErr w:type="spellStart"/>
+      <w:r>
+        <w:t>pristupe</w:t>
+      </w:r>
+      <w:proofErr w:type="spellEnd"/>
+      <w:r>
+        <w:t xml:space="preserve">: </w:t>
+      </w:r>
+      <w:r>
+        <w:rPr>
+          <w:i/>
+          <w:iCs/>
+        </w:rPr>
+        <w:t>"unlike switch statements, the lookup table method has no default case to catch out-of-range values. With a lookup table, out-of-range values cause the program to crash!"</w:t>
+      </w:r>
+      <w:r>
+        <w:t xml:space="preserve"> </w:t>
+      </w:r>
+      <w:r>
+        <w:t xml:space="preserve">. </w:t>
+      </w:r>
+      <w:proofErr w:type="spellStart"/>
+      <w:r>
+        <w:t>Ugnježđeni</w:t>
+      </w:r>
+      <w:proofErr w:type="spellEnd"/>
+      <w:r>
+        <w:t xml:space="preserve"> switch </w:t>
+      </w:r>
+      <w:proofErr w:type="spellStart"/>
+      <w:r>
+        <w:t>ima</w:t>
+      </w:r>
+      <w:proofErr w:type="spellEnd"/>
+      <w:r>
+        <w:t xml:space="preserve"> </w:t>
+      </w:r>
+      <w:proofErr w:type="spellStart"/>
+      <w:r>
+        <w:t>ugrađenu</w:t>
+      </w:r>
+      <w:proofErr w:type="spellEnd"/>
+      <w:r>
+        <w:t xml:space="preserve"> </w:t>
+      </w:r>
+      <w:proofErr w:type="spellStart"/>
+      <w:r>
+        <w:t>zaštitu</w:t>
+      </w:r>
+      <w:proofErr w:type="spellEnd"/>
+      <w:r>
+        <w:t xml:space="preserve"> (default: grana) </w:t>
+      </w:r>
+      <w:proofErr w:type="spellStart"/>
+      <w:r>
+        <w:t>koja</w:t>
+      </w:r>
+      <w:proofErr w:type="spellEnd"/>
+      <w:r>
+        <w:t xml:space="preserve"> </w:t>
+      </w:r>
+      <w:proofErr w:type="spellStart"/>
+      <w:r>
+        <w:t>nevalidan</w:t>
+      </w:r>
+      <w:proofErr w:type="spellEnd"/>
+      <w:r>
+        <w:t xml:space="preserve"> </w:t>
+      </w:r>
+      <w:proofErr w:type="spellStart"/>
+      <w:r>
+        <w:t>ulaz</w:t>
+      </w:r>
+      <w:proofErr w:type="spellEnd"/>
+      <w:r>
+        <w:t xml:space="preserve"> </w:t>
+      </w:r>
+      <w:proofErr w:type="spellStart"/>
+      <w:r>
+        <w:t>jednostavno</w:t>
+      </w:r>
+      <w:proofErr w:type="spellEnd"/>
+      <w:r>
+        <w:t xml:space="preserve"> </w:t>
+      </w:r>
+      <w:proofErr w:type="spellStart"/>
+      <w:r>
+        <w:t>ignoriše</w:t>
+      </w:r>
+      <w:proofErr w:type="spellEnd"/>
+      <w:r>
+        <w:t xml:space="preserve"> </w:t>
+      </w:r>
+      <w:proofErr w:type="spellStart"/>
+      <w:r>
+        <w:t>ili</w:t>
+      </w:r>
+      <w:proofErr w:type="spellEnd"/>
+      <w:r>
+        <w:t xml:space="preserve"> </w:t>
+      </w:r>
+      <w:proofErr w:type="spellStart"/>
+      <w:r>
+        <w:t>preusmeri</w:t>
+      </w:r>
+      <w:proofErr w:type="spellEnd"/>
+      <w:r>
+        <w:t xml:space="preserve"> </w:t>
+      </w:r>
+      <w:proofErr w:type="spellStart"/>
+      <w:r>
+        <w:t>na</w:t>
+      </w:r>
+      <w:proofErr w:type="spellEnd"/>
+      <w:r>
+        <w:t xml:space="preserve"> </w:t>
+      </w:r>
+      <w:proofErr w:type="spellStart"/>
+      <w:r>
+        <w:t>bezbedno</w:t>
+      </w:r>
+      <w:proofErr w:type="spellEnd"/>
+      <w:r>
+        <w:t xml:space="preserve"> </w:t>
+      </w:r>
+      <w:proofErr w:type="spellStart"/>
+      <w:r>
+        <w:t>ponašanje</w:t>
+      </w:r>
+      <w:proofErr w:type="spellEnd"/>
+      <w:r>
+        <w:t>.</w:t>
+      </w:r>
+      <w:r>
+        <w:t xml:space="preserve"> </w:t>
+      </w:r>
+      <w:proofErr w:type="spellStart"/>
+      <w:r>
+        <w:t>D</w:t>
+      </w:r>
+      <w:r>
+        <w:t>irektno</w:t>
+      </w:r>
+      <w:proofErr w:type="spellEnd"/>
+      <w:r>
+        <w:t xml:space="preserve"> </w:t>
+      </w:r>
+      <w:proofErr w:type="spellStart"/>
+      <w:r>
+        <w:t>indeksiranje</w:t>
+      </w:r>
+      <w:proofErr w:type="spellEnd"/>
+      <w:r>
+        <w:t xml:space="preserve"> </w:t>
+      </w:r>
+      <w:proofErr w:type="spellStart"/>
+      <w:r>
+        <w:t>niza</w:t>
+      </w:r>
+      <w:proofErr w:type="spellEnd"/>
+      <w:r>
+        <w:t xml:space="preserve"> (</w:t>
+      </w:r>
+      <w:proofErr w:type="spellStart"/>
+      <w:r>
+        <w:t>nevažno</w:t>
+      </w:r>
+      <w:proofErr w:type="spellEnd"/>
+      <w:r>
+        <w:t xml:space="preserve"> da li je</w:t>
+      </w:r>
+      <w:r>
+        <w:t xml:space="preserve"> </w:t>
+      </w:r>
+      <w:proofErr w:type="spellStart"/>
+      <w:r>
+        <w:t>Direktni</w:t>
+      </w:r>
+      <w:proofErr w:type="spellEnd"/>
+      <w:r>
+        <w:t xml:space="preserve"> LUT FSM </w:t>
+      </w:r>
+      <w:proofErr w:type="spellStart"/>
+      <w:r>
+        <w:t>ili</w:t>
+      </w:r>
+      <w:proofErr w:type="spellEnd"/>
+      <w:r>
+        <w:t xml:space="preserve"> </w:t>
+      </w:r>
+      <w:r>
+        <w:t xml:space="preserve"> </w:t>
+      </w:r>
+      <w:proofErr w:type="spellStart"/>
+      <w:r>
+        <w:t>bilo</w:t>
+      </w:r>
+      <w:proofErr w:type="spellEnd"/>
+      <w:r>
+        <w:t xml:space="preserve"> </w:t>
+      </w:r>
+      <w:proofErr w:type="spellStart"/>
+      <w:r>
+        <w:t>koja</w:t>
+      </w:r>
+      <w:proofErr w:type="spellEnd"/>
+      <w:r>
+        <w:t xml:space="preserve"> </w:t>
+      </w:r>
+      <w:proofErr w:type="spellStart"/>
+      <w:r>
+        <w:t>varijanta</w:t>
+      </w:r>
+      <w:proofErr w:type="spellEnd"/>
+      <w:r>
+        <w:t xml:space="preserve"> </w:t>
+      </w:r>
+      <w:proofErr w:type="spellStart"/>
+      <w:r>
+        <w:t>sa</w:t>
+      </w:r>
+      <w:proofErr w:type="spellEnd"/>
+      <w:r>
+        <w:t xml:space="preserve"> </w:t>
+      </w:r>
+      <w:proofErr w:type="spellStart"/>
+      <w:r>
+        <w:t>pokazivačima</w:t>
+      </w:r>
+      <w:proofErr w:type="spellEnd"/>
+      <w:r>
+        <w:t xml:space="preserve"> </w:t>
+      </w:r>
+      <w:proofErr w:type="spellStart"/>
+      <w:r>
+        <w:t>na</w:t>
+      </w:r>
+      <w:proofErr w:type="spellEnd"/>
+      <w:r>
+        <w:t xml:space="preserve"> </w:t>
+      </w:r>
+      <w:proofErr w:type="spellStart"/>
+      <w:r>
+        <w:t>funkcije</w:t>
+      </w:r>
+      <w:proofErr w:type="spellEnd"/>
+      <w:r>
+        <w:t xml:space="preserve">) </w:t>
+      </w:r>
+      <w:proofErr w:type="spellStart"/>
+      <w:r>
+        <w:t>tu</w:t>
+      </w:r>
+      <w:proofErr w:type="spellEnd"/>
+      <w:r>
+        <w:t xml:space="preserve"> </w:t>
+      </w:r>
+      <w:proofErr w:type="spellStart"/>
+      <w:r>
+        <w:t>zaštitu</w:t>
+      </w:r>
+      <w:proofErr w:type="spellEnd"/>
+      <w:r>
+        <w:t xml:space="preserve"> </w:t>
+      </w:r>
+      <w:proofErr w:type="spellStart"/>
+      <w:r>
+        <w:t>nema</w:t>
+      </w:r>
+      <w:proofErr w:type="spellEnd"/>
+      <w:r>
+        <w:t xml:space="preserve"> </w:t>
+      </w:r>
+      <w:proofErr w:type="spellStart"/>
+      <w:r>
+        <w:t>ugrađenu</w:t>
+      </w:r>
+      <w:proofErr w:type="spellEnd"/>
+      <w:r>
+        <w:t xml:space="preserve"> u </w:t>
+      </w:r>
+      <w:proofErr w:type="spellStart"/>
+      <w:r>
+        <w:t>sam</w:t>
+      </w:r>
+      <w:proofErr w:type="spellEnd"/>
+      <w:r>
+        <w:t xml:space="preserve"> </w:t>
+      </w:r>
+      <w:proofErr w:type="spellStart"/>
+      <w:r>
+        <w:t>mehanizam</w:t>
+      </w:r>
+      <w:proofErr w:type="spellEnd"/>
+      <w:r>
+        <w:t xml:space="preserve"> </w:t>
+      </w:r>
+      <w:proofErr w:type="spellStart"/>
+      <w:r>
+        <w:t>i</w:t>
+      </w:r>
+      <w:proofErr w:type="spellEnd"/>
+      <w:r>
+        <w:t xml:space="preserve"> </w:t>
+      </w:r>
+      <w:proofErr w:type="spellStart"/>
+      <w:r>
+        <w:t>neophodno</w:t>
+      </w:r>
+      <w:proofErr w:type="spellEnd"/>
+      <w:r>
+        <w:t xml:space="preserve"> </w:t>
+      </w:r>
+      <w:proofErr w:type="spellStart"/>
+      <w:r>
+        <w:t>ju</w:t>
+      </w:r>
+      <w:proofErr w:type="spellEnd"/>
+      <w:r>
+        <w:t xml:space="preserve"> je</w:t>
+      </w:r>
+      <w:r>
+        <w:t xml:space="preserve"> </w:t>
+      </w:r>
+      <w:proofErr w:type="spellStart"/>
+      <w:r>
+        <w:t>eksplicitno</w:t>
+      </w:r>
+      <w:proofErr w:type="spellEnd"/>
+      <w:r>
+        <w:t xml:space="preserve"> </w:t>
+      </w:r>
+      <w:proofErr w:type="spellStart"/>
+      <w:r>
+        <w:t>dodati</w:t>
+      </w:r>
+      <w:proofErr w:type="spellEnd"/>
+      <w:r>
+        <w:t xml:space="preserve"> </w:t>
+      </w:r>
+      <w:proofErr w:type="spellStart"/>
+      <w:r>
+        <w:t>kao</w:t>
+      </w:r>
+      <w:proofErr w:type="spellEnd"/>
+      <w:r>
+        <w:t xml:space="preserve"> </w:t>
+      </w:r>
+      <w:proofErr w:type="spellStart"/>
+      <w:r>
+        <w:t>prover</w:t>
+      </w:r>
+      <w:r>
+        <w:t>u</w:t>
+      </w:r>
+      <w:proofErr w:type="spellEnd"/>
+      <w:r>
+        <w:t xml:space="preserve"> pre </w:t>
+      </w:r>
+      <w:proofErr w:type="spellStart"/>
+      <w:r>
+        <w:t>pristupa</w:t>
+      </w:r>
+      <w:proofErr w:type="spellEnd"/>
+      <w:r>
+        <w:t xml:space="preserve"> </w:t>
+      </w:r>
+      <w:proofErr w:type="spellStart"/>
+      <w:r>
+        <w:t>nizu</w:t>
+      </w:r>
+      <w:proofErr w:type="spellEnd"/>
+      <w:r>
+        <w:t>.</w:t>
+      </w:r>
+      <w:r>
+        <w:t xml:space="preserve"> </w:t>
+      </w:r>
+      <w:proofErr w:type="spellStart"/>
+      <w:r>
+        <w:t>I</w:t>
+      </w:r>
+      <w:r>
+        <w:t>nače</w:t>
+      </w:r>
+      <w:proofErr w:type="spellEnd"/>
+      <w:r>
+        <w:t xml:space="preserve"> </w:t>
+      </w:r>
+      <w:proofErr w:type="spellStart"/>
+      <w:r>
+        <w:t>će</w:t>
+      </w:r>
+      <w:proofErr w:type="spellEnd"/>
+      <w:r>
+        <w:t xml:space="preserve"> </w:t>
+      </w:r>
+      <w:proofErr w:type="spellStart"/>
+      <w:r>
+        <w:t>nevalidan</w:t>
+      </w:r>
+      <w:proofErr w:type="spellEnd"/>
+      <w:r>
+        <w:t xml:space="preserve"> </w:t>
+      </w:r>
+      <w:proofErr w:type="spellStart"/>
+      <w:r>
+        <w:t>indeks</w:t>
+      </w:r>
+      <w:proofErr w:type="spellEnd"/>
+      <w:r>
+        <w:t xml:space="preserve"> </w:t>
+      </w:r>
+      <w:proofErr w:type="spellStart"/>
+      <w:r>
+        <w:t>do</w:t>
+      </w:r>
+      <w:r>
+        <w:t>vesti</w:t>
+      </w:r>
+      <w:r>
+        <w:t>i</w:t>
+      </w:r>
+      <w:proofErr w:type="spellEnd"/>
+      <w:r>
+        <w:t xml:space="preserve"> do </w:t>
+      </w:r>
+      <w:proofErr w:type="spellStart"/>
+      <w:r>
+        <w:t>nedefinisanog</w:t>
+      </w:r>
+      <w:proofErr w:type="spellEnd"/>
+      <w:r>
+        <w:t xml:space="preserve"> </w:t>
+      </w:r>
+      <w:proofErr w:type="spellStart"/>
+      <w:r>
+        <w:t>ponašanja</w:t>
+      </w:r>
+      <w:proofErr w:type="spellEnd"/>
+      <w:r>
+        <w:t xml:space="preserve"> (</w:t>
+      </w:r>
+      <w:proofErr w:type="spellStart"/>
+      <w:r>
+        <w:t>čitanje</w:t>
+      </w:r>
+      <w:proofErr w:type="spellEnd"/>
+      <w:r>
+        <w:t xml:space="preserve"> van </w:t>
+      </w:r>
+      <w:proofErr w:type="spellStart"/>
+      <w:r>
+        <w:t>granica</w:t>
+      </w:r>
+      <w:proofErr w:type="spellEnd"/>
+      <w:r>
+        <w:t xml:space="preserve"> </w:t>
+      </w:r>
+      <w:proofErr w:type="spellStart"/>
+      <w:r>
+        <w:t>niza</w:t>
+      </w:r>
+      <w:proofErr w:type="spellEnd"/>
+      <w:r>
+        <w:t xml:space="preserve">, </w:t>
+      </w:r>
+      <w:proofErr w:type="spellStart"/>
+      <w:r>
+        <w:t>potencijalni</w:t>
+      </w:r>
+      <w:proofErr w:type="spellEnd"/>
+      <w:r>
+        <w:t xml:space="preserve"> </w:t>
+      </w:r>
+      <w:proofErr w:type="spellStart"/>
+      <w:r>
+        <w:t>skok</w:t>
+      </w:r>
+      <w:proofErr w:type="spellEnd"/>
+      <w:r>
+        <w:t xml:space="preserve"> </w:t>
+      </w:r>
+      <w:proofErr w:type="spellStart"/>
+      <w:r>
+        <w:t>na</w:t>
+      </w:r>
+      <w:proofErr w:type="spellEnd"/>
+      <w:r>
+        <w:t xml:space="preserve"> </w:t>
+      </w:r>
+      <w:proofErr w:type="spellStart"/>
+      <w:r>
+        <w:t>proizvoljnu</w:t>
+      </w:r>
+      <w:proofErr w:type="spellEnd"/>
+      <w:r>
+        <w:t xml:space="preserve"> </w:t>
+      </w:r>
+      <w:proofErr w:type="spellStart"/>
+      <w:r>
+        <w:t>adresu</w:t>
+      </w:r>
+      <w:proofErr w:type="spellEnd"/>
+      <w:r>
+        <w:t xml:space="preserve"> u </w:t>
+      </w:r>
+      <w:proofErr w:type="spellStart"/>
+      <w:r>
+        <w:t>memoriji</w:t>
+      </w:r>
+      <w:proofErr w:type="spellEnd"/>
+      <w:r>
+        <w:t xml:space="preserve"> </w:t>
+      </w:r>
+      <w:proofErr w:type="spellStart"/>
+      <w:r>
+        <w:t>ako</w:t>
+      </w:r>
+      <w:proofErr w:type="spellEnd"/>
+      <w:r>
+        <w:t xml:space="preserve"> se </w:t>
+      </w:r>
+      <w:proofErr w:type="spellStart"/>
+      <w:r>
+        <w:t>radi</w:t>
+      </w:r>
+      <w:proofErr w:type="spellEnd"/>
+      <w:r>
+        <w:t xml:space="preserve"> o </w:t>
+      </w:r>
+      <w:proofErr w:type="spellStart"/>
+      <w:r>
+        <w:t>nizu</w:t>
+      </w:r>
+      <w:proofErr w:type="spellEnd"/>
+      <w:r>
+        <w:t xml:space="preserve"> </w:t>
+      </w:r>
+      <w:proofErr w:type="spellStart"/>
+      <w:r>
+        <w:t>pokazivača</w:t>
+      </w:r>
+      <w:proofErr w:type="spellEnd"/>
+      <w:r>
+        <w:t xml:space="preserve"> </w:t>
+      </w:r>
+      <w:proofErr w:type="spellStart"/>
+      <w:r>
+        <w:t>na</w:t>
+      </w:r>
+      <w:proofErr w:type="spellEnd"/>
+      <w:r>
+        <w:t xml:space="preserve"> </w:t>
+      </w:r>
+      <w:proofErr w:type="spellStart"/>
+      <w:r>
+        <w:t>funkcije</w:t>
+      </w:r>
+      <w:proofErr w:type="spellEnd"/>
+      <w:r>
+        <w:t xml:space="preserve">). Ovo je </w:t>
+      </w:r>
+      <w:proofErr w:type="spellStart"/>
+      <w:r>
+        <w:t>važna</w:t>
+      </w:r>
+      <w:proofErr w:type="spellEnd"/>
+      <w:r>
+        <w:t xml:space="preserve">, </w:t>
+      </w:r>
+      <w:proofErr w:type="spellStart"/>
+      <w:r>
+        <w:t>praktično</w:t>
+      </w:r>
+      <w:proofErr w:type="spellEnd"/>
+      <w:r>
+        <w:t xml:space="preserve"> </w:t>
+      </w:r>
+      <w:proofErr w:type="spellStart"/>
+      <w:r>
+        <w:t>orijentisana</w:t>
+      </w:r>
+      <w:proofErr w:type="spellEnd"/>
+      <w:r>
+        <w:t xml:space="preserve"> </w:t>
+      </w:r>
+      <w:proofErr w:type="spellStart"/>
+      <w:r>
+        <w:t>napomena</w:t>
+      </w:r>
+      <w:proofErr w:type="spellEnd"/>
+      <w:r>
+        <w:t xml:space="preserve"> </w:t>
+      </w:r>
+      <w:proofErr w:type="spellStart"/>
+      <w:r>
+        <w:t>koja</w:t>
+      </w:r>
+      <w:proofErr w:type="spellEnd"/>
+      <w:r>
+        <w:t xml:space="preserve"> </w:t>
+      </w:r>
+      <w:proofErr w:type="spellStart"/>
+      <w:r>
+        <w:t>dopunjuje</w:t>
+      </w:r>
+      <w:proofErr w:type="spellEnd"/>
+      <w:r>
+        <w:t xml:space="preserve"> </w:t>
+      </w:r>
+      <w:proofErr w:type="spellStart"/>
+      <w:r>
+        <w:t>čisto</w:t>
+      </w:r>
+      <w:proofErr w:type="spellEnd"/>
+      <w:r>
+        <w:t xml:space="preserve"> </w:t>
+      </w:r>
+      <w:proofErr w:type="spellStart"/>
+      <w:r>
+        <w:t>teorijsko</w:t>
+      </w:r>
+      <w:proofErr w:type="spellEnd"/>
+      <w:r>
+        <w:t xml:space="preserve"> </w:t>
+      </w:r>
+      <w:proofErr w:type="spellStart"/>
+      <w:r>
+        <w:t>poređenje</w:t>
+      </w:r>
+      <w:proofErr w:type="spellEnd"/>
+      <w:r>
+        <w:t xml:space="preserve"> </w:t>
+      </w:r>
+      <w:proofErr w:type="spellStart"/>
+      <w:r>
+        <w:t>performansi</w:t>
+      </w:r>
+      <w:proofErr w:type="spellEnd"/>
+      <w:r>
+        <w:t xml:space="preserve"> u </w:t>
+      </w:r>
+      <w:proofErr w:type="spellStart"/>
+      <w:r>
+        <w:t>ovom</w:t>
+      </w:r>
+      <w:proofErr w:type="spellEnd"/>
+      <w:r>
+        <w:t xml:space="preserve"> </w:t>
+      </w:r>
+      <w:proofErr w:type="spellStart"/>
+      <w:r>
+        <w:t>radu</w:t>
+      </w:r>
+      <w:proofErr w:type="spellEnd"/>
+      <w:r>
+        <w:t xml:space="preserve"> </w:t>
+      </w:r>
+      <w:proofErr w:type="spellStart"/>
+      <w:r>
+        <w:t>jednim</w:t>
+      </w:r>
+      <w:proofErr w:type="spellEnd"/>
+      <w:r>
+        <w:t xml:space="preserve"> </w:t>
+      </w:r>
+      <w:proofErr w:type="spellStart"/>
+      <w:r>
+        <w:t>inženjerskim</w:t>
+      </w:r>
+      <w:proofErr w:type="spellEnd"/>
+      <w:r>
+        <w:t xml:space="preserve"> </w:t>
+      </w:r>
+      <w:proofErr w:type="spellStart"/>
+      <w:r>
+        <w:t>kompromisom</w:t>
+      </w:r>
+      <w:proofErr w:type="spellEnd"/>
+      <w:r>
+        <w:t xml:space="preserve"> koji </w:t>
+      </w:r>
+      <w:proofErr w:type="spellStart"/>
+      <w:r>
+        <w:t>akademski</w:t>
+      </w:r>
+      <w:proofErr w:type="spellEnd"/>
+      <w:r>
+        <w:t xml:space="preserve"> </w:t>
+      </w:r>
+      <w:proofErr w:type="spellStart"/>
+      <w:r>
+        <w:t>izvori</w:t>
+      </w:r>
+      <w:proofErr w:type="spellEnd"/>
+      <w:r>
+        <w:t xml:space="preserve"> ne </w:t>
+      </w:r>
+      <w:proofErr w:type="spellStart"/>
+      <w:r>
+        <w:t>pominju</w:t>
+      </w:r>
+      <w:proofErr w:type="spellEnd"/>
+      <w:r>
+        <w:t xml:space="preserve">: </w:t>
+      </w:r>
+      <w:proofErr w:type="spellStart"/>
+      <w:r>
+        <w:t>brzina</w:t>
+      </w:r>
+      <w:proofErr w:type="spellEnd"/>
+      <w:r>
+        <w:t xml:space="preserve"> </w:t>
+      </w:r>
+      <w:proofErr w:type="spellStart"/>
+      <w:r>
+        <w:t>tabelarnih</w:t>
+      </w:r>
+      <w:proofErr w:type="spellEnd"/>
+      <w:r>
+        <w:t xml:space="preserve"> </w:t>
+      </w:r>
+      <w:proofErr w:type="spellStart"/>
+      <w:r>
+        <w:t>pristupa</w:t>
+      </w:r>
+      <w:proofErr w:type="spellEnd"/>
+      <w:r>
+        <w:t xml:space="preserve"> </w:t>
+      </w:r>
+      <w:proofErr w:type="spellStart"/>
+      <w:r>
+        <w:t>dolazi</w:t>
+      </w:r>
+      <w:proofErr w:type="spellEnd"/>
+      <w:r>
+        <w:t xml:space="preserve"> </w:t>
+      </w:r>
+      <w:proofErr w:type="spellStart"/>
+      <w:r>
+        <w:t>uz</w:t>
+      </w:r>
+      <w:proofErr w:type="spellEnd"/>
+      <w:r>
+        <w:t xml:space="preserve"> </w:t>
+      </w:r>
+      <w:proofErr w:type="spellStart"/>
+      <w:r>
+        <w:t>odgovornost</w:t>
+      </w:r>
+      <w:proofErr w:type="spellEnd"/>
+      <w:r>
+        <w:t xml:space="preserve"> da se </w:t>
+      </w:r>
+      <w:proofErr w:type="spellStart"/>
+      <w:r>
+        <w:t>granice</w:t>
+      </w:r>
+      <w:proofErr w:type="spellEnd"/>
+      <w:r>
+        <w:t xml:space="preserve"> </w:t>
+      </w:r>
+      <w:proofErr w:type="spellStart"/>
+      <w:r>
+        <w:t>provere</w:t>
+      </w:r>
+      <w:proofErr w:type="spellEnd"/>
+      <w:r>
+        <w:t xml:space="preserve"> </w:t>
+      </w:r>
+      <w:proofErr w:type="spellStart"/>
+      <w:r>
+        <w:t>ručno</w:t>
+      </w:r>
+      <w:proofErr w:type="spellEnd"/>
+      <w:r>
+        <w:t xml:space="preserve">, van </w:t>
+      </w:r>
+      <w:proofErr w:type="spellStart"/>
+      <w:r>
+        <w:t>samog</w:t>
+      </w:r>
+      <w:proofErr w:type="spellEnd"/>
+      <w:r>
+        <w:t xml:space="preserve"> </w:t>
+      </w:r>
+      <w:proofErr w:type="spellStart"/>
+      <w:r>
+        <w:t>mehanizma</w:t>
+      </w:r>
+      <w:proofErr w:type="spellEnd"/>
+      <w:r>
+        <w:t xml:space="preserve"> </w:t>
+      </w:r>
+      <w:proofErr w:type="spellStart"/>
+      <w:r>
+        <w:t>dispečovanja</w:t>
+      </w:r>
+      <w:proofErr w:type="spellEnd"/>
+      <w:r>
+        <w:t>.</w:t>
+      </w:r>
+    </w:p>
+    <w:p>
+      <w:pPr>
+        <w:rPr>
+          <w:color w:val="EE0000"/>
+        </w:rPr>
+      </w:pPr>
+      <w:proofErr w:type="spellStart"/>
+      <w:r>
+        <w:rPr>
+          <w:color w:val="EE0000"/>
+        </w:rPr>
+        <w:t>Budući</w:t>
+      </w:r>
+      <w:proofErr w:type="spellEnd"/>
+      <w:r>
+        <w:rPr>
+          <w:color w:val="EE0000"/>
+        </w:rPr>
+        <w:t xml:space="preserve"> da se </w:t>
+      </w:r>
+      <w:proofErr w:type="spellStart"/>
+      <w:r>
+        <w:rPr>
+          <w:color w:val="EE0000"/>
+        </w:rPr>
+        <w:t>ovaj</w:t>
+      </w:r>
+      <w:proofErr w:type="spellEnd"/>
+      <w:r>
+        <w:rPr>
+          <w:color w:val="EE0000"/>
+        </w:rPr>
+        <w:t xml:space="preserve"> </w:t>
+      </w:r>
+      <w:proofErr w:type="spellStart"/>
+      <w:r>
+        <w:rPr>
+          <w:color w:val="EE0000"/>
+        </w:rPr>
+        <w:t>pristup</w:t>
+      </w:r>
+      <w:proofErr w:type="spellEnd"/>
+      <w:r>
+        <w:rPr>
+          <w:color w:val="EE0000"/>
+        </w:rPr>
+        <w:t xml:space="preserve"> </w:t>
+      </w:r>
+      <w:proofErr w:type="spellStart"/>
+      <w:r>
+        <w:rPr>
+          <w:color w:val="EE0000"/>
+        </w:rPr>
+        <w:t>razlikuje</w:t>
+      </w:r>
+      <w:proofErr w:type="spellEnd"/>
+      <w:r>
+        <w:rPr>
+          <w:color w:val="EE0000"/>
+        </w:rPr>
+        <w:t xml:space="preserve"> od fsm_function_pointers.cpp </w:t>
+      </w:r>
+      <w:proofErr w:type="spellStart"/>
+      <w:r>
+        <w:rPr>
+          <w:color w:val="EE0000"/>
+        </w:rPr>
+        <w:t>samo</w:t>
+      </w:r>
+      <w:proofErr w:type="spellEnd"/>
+      <w:r>
+        <w:rPr>
+          <w:color w:val="EE0000"/>
+        </w:rPr>
+        <w:t xml:space="preserve"> u </w:t>
+      </w:r>
+      <w:proofErr w:type="spellStart"/>
+      <w:r>
+        <w:rPr>
+          <w:color w:val="EE0000"/>
+        </w:rPr>
+        <w:t>načinu</w:t>
+      </w:r>
+      <w:proofErr w:type="spellEnd"/>
+      <w:r>
+        <w:rPr>
+          <w:color w:val="EE0000"/>
+        </w:rPr>
+        <w:t xml:space="preserve"> </w:t>
+      </w:r>
+      <w:proofErr w:type="spellStart"/>
+      <w:r>
+        <w:rPr>
+          <w:color w:val="EE0000"/>
+        </w:rPr>
+        <w:t>prenosa</w:t>
+      </w:r>
+      <w:proofErr w:type="spellEnd"/>
+      <w:r>
+        <w:rPr>
+          <w:color w:val="EE0000"/>
+        </w:rPr>
+        <w:t xml:space="preserve"> </w:t>
+      </w:r>
+      <w:proofErr w:type="spellStart"/>
+      <w:r>
+        <w:rPr>
+          <w:color w:val="EE0000"/>
+        </w:rPr>
+        <w:t>rezultata</w:t>
+      </w:r>
+      <w:proofErr w:type="spellEnd"/>
+      <w:r>
+        <w:rPr>
+          <w:color w:val="EE0000"/>
+        </w:rPr>
+        <w:t xml:space="preserve"> (ne u </w:t>
+      </w:r>
+      <w:proofErr w:type="spellStart"/>
+      <w:r>
+        <w:rPr>
+          <w:color w:val="EE0000"/>
+        </w:rPr>
+        <w:t>broju</w:t>
+      </w:r>
+      <w:proofErr w:type="spellEnd"/>
+      <w:r>
+        <w:rPr>
+          <w:color w:val="EE0000"/>
+        </w:rPr>
+        <w:t xml:space="preserve"> </w:t>
+      </w:r>
+      <w:proofErr w:type="spellStart"/>
+      <w:r>
+        <w:rPr>
+          <w:color w:val="EE0000"/>
+        </w:rPr>
+        <w:t>indirektnih</w:t>
+      </w:r>
+      <w:proofErr w:type="spellEnd"/>
+      <w:r>
+        <w:rPr>
+          <w:color w:val="EE0000"/>
+        </w:rPr>
+        <w:t xml:space="preserve"> </w:t>
+      </w:r>
+      <w:proofErr w:type="spellStart"/>
+      <w:r>
+        <w:rPr>
+          <w:color w:val="EE0000"/>
+        </w:rPr>
+        <w:t>poziva</w:t>
+      </w:r>
+      <w:proofErr w:type="spellEnd"/>
+      <w:r>
+        <w:rPr>
+          <w:color w:val="EE0000"/>
+        </w:rPr>
+        <w:t xml:space="preserve">), </w:t>
+      </w:r>
+      <w:proofErr w:type="spellStart"/>
+      <w:r>
+        <w:rPr>
+          <w:color w:val="EE0000"/>
+        </w:rPr>
+        <w:t>teorijski</w:t>
+      </w:r>
+      <w:proofErr w:type="spellEnd"/>
+      <w:r>
+        <w:rPr>
+          <w:color w:val="EE0000"/>
+        </w:rPr>
+        <w:t xml:space="preserve"> se ne </w:t>
+      </w:r>
+      <w:proofErr w:type="spellStart"/>
+      <w:r>
+        <w:rPr>
+          <w:color w:val="EE0000"/>
+        </w:rPr>
+        <w:t>očekuje</w:t>
+      </w:r>
+      <w:proofErr w:type="spellEnd"/>
+      <w:r>
+        <w:rPr>
+          <w:color w:val="EE0000"/>
+        </w:rPr>
+        <w:t xml:space="preserve"> </w:t>
+      </w:r>
+      <w:proofErr w:type="spellStart"/>
+      <w:r>
+        <w:rPr>
+          <w:color w:val="EE0000"/>
+        </w:rPr>
+        <w:t>merljiva</w:t>
+      </w:r>
+      <w:proofErr w:type="spellEnd"/>
+      <w:r>
+        <w:rPr>
+          <w:color w:val="EE0000"/>
+        </w:rPr>
+        <w:t xml:space="preserve"> </w:t>
+      </w:r>
+      <w:proofErr w:type="spellStart"/>
+      <w:r>
+        <w:rPr>
+          <w:color w:val="EE0000"/>
+        </w:rPr>
+        <w:t>razlika</w:t>
+      </w:r>
+      <w:proofErr w:type="spellEnd"/>
+      <w:r>
+        <w:rPr>
+          <w:color w:val="EE0000"/>
+        </w:rPr>
+        <w:t xml:space="preserve"> u </w:t>
+      </w:r>
+      <w:proofErr w:type="spellStart"/>
+      <w:r>
+        <w:rPr>
+          <w:color w:val="EE0000"/>
+        </w:rPr>
+        <w:t>broju</w:t>
+      </w:r>
+      <w:proofErr w:type="spellEnd"/>
+      <w:r>
+        <w:rPr>
+          <w:color w:val="EE0000"/>
+        </w:rPr>
+        <w:t xml:space="preserve"> </w:t>
+      </w:r>
+      <w:proofErr w:type="spellStart"/>
+      <w:r>
+        <w:rPr>
+          <w:color w:val="EE0000"/>
+        </w:rPr>
+        <w:t>ciklusa</w:t>
+      </w:r>
+      <w:proofErr w:type="spellEnd"/>
+      <w:r>
+        <w:rPr>
+          <w:color w:val="EE0000"/>
+        </w:rPr>
+        <w:t xml:space="preserve"> </w:t>
+      </w:r>
+      <w:proofErr w:type="spellStart"/>
+      <w:r>
+        <w:rPr>
+          <w:color w:val="EE0000"/>
+        </w:rPr>
+        <w:t>između</w:t>
+      </w:r>
+      <w:proofErr w:type="spellEnd"/>
+      <w:r>
+        <w:rPr>
+          <w:color w:val="EE0000"/>
+        </w:rPr>
+        <w:t xml:space="preserve"> </w:t>
+      </w:r>
+      <w:proofErr w:type="spellStart"/>
+      <w:r>
+        <w:rPr>
+          <w:color w:val="EE0000"/>
+        </w:rPr>
+        <w:t>njih</w:t>
+      </w:r>
+      <w:proofErr w:type="spellEnd"/>
+      <w:r>
+        <w:rPr>
+          <w:color w:val="EE0000"/>
+        </w:rPr>
+        <w:t xml:space="preserve"> — </w:t>
+      </w:r>
+      <w:proofErr w:type="spellStart"/>
+      <w:r>
+        <w:rPr>
+          <w:color w:val="EE0000"/>
+        </w:rPr>
+        <w:t>obe</w:t>
+      </w:r>
+      <w:proofErr w:type="spellEnd"/>
+      <w:r>
+        <w:rPr>
+          <w:color w:val="EE0000"/>
+        </w:rPr>
+        <w:t xml:space="preserve"> </w:t>
+      </w:r>
+      <w:proofErr w:type="spellStart"/>
+      <w:r>
+        <w:rPr>
+          <w:color w:val="EE0000"/>
+        </w:rPr>
+        <w:t>implementacije</w:t>
+      </w:r>
+      <w:proofErr w:type="spellEnd"/>
+      <w:r>
+        <w:rPr>
+          <w:color w:val="EE0000"/>
+        </w:rPr>
+        <w:t xml:space="preserve"> </w:t>
+      </w:r>
+      <w:proofErr w:type="spellStart"/>
+      <w:r>
+        <w:rPr>
+          <w:color w:val="EE0000"/>
+        </w:rPr>
+        <w:t>na</w:t>
+      </w:r>
+      <w:proofErr w:type="spellEnd"/>
+      <w:r>
+        <w:rPr>
+          <w:color w:val="EE0000"/>
+        </w:rPr>
+        <w:t xml:space="preserve"> </w:t>
+      </w:r>
+      <w:proofErr w:type="spellStart"/>
+      <w:r>
+        <w:rPr>
+          <w:color w:val="EE0000"/>
+        </w:rPr>
+        <w:t>mašinskom</w:t>
+      </w:r>
+      <w:proofErr w:type="spellEnd"/>
+      <w:r>
+        <w:rPr>
+          <w:color w:val="EE0000"/>
+        </w:rPr>
+        <w:t xml:space="preserve"> </w:t>
+      </w:r>
+      <w:proofErr w:type="spellStart"/>
+      <w:r>
+        <w:rPr>
+          <w:color w:val="EE0000"/>
+        </w:rPr>
+        <w:t>nivou</w:t>
+      </w:r>
+      <w:proofErr w:type="spellEnd"/>
+      <w:r>
+        <w:rPr>
+          <w:color w:val="EE0000"/>
+        </w:rPr>
+        <w:t xml:space="preserve"> </w:t>
+      </w:r>
+      <w:proofErr w:type="spellStart"/>
+      <w:r>
+        <w:rPr>
+          <w:color w:val="EE0000"/>
+        </w:rPr>
+        <w:t>izvršavaju</w:t>
+      </w:r>
+      <w:proofErr w:type="spellEnd"/>
+      <w:r>
+        <w:rPr>
+          <w:color w:val="EE0000"/>
+        </w:rPr>
+        <w:t xml:space="preserve"> </w:t>
+      </w:r>
+      <w:proofErr w:type="spellStart"/>
+      <w:r>
+        <w:rPr>
+          <w:color w:val="EE0000"/>
+        </w:rPr>
+        <w:t>jedan</w:t>
+      </w:r>
+      <w:proofErr w:type="spellEnd"/>
+      <w:r>
+        <w:rPr>
+          <w:color w:val="EE0000"/>
+        </w:rPr>
+        <w:t xml:space="preserve"> </w:t>
+      </w:r>
+      <w:proofErr w:type="spellStart"/>
+      <w:r>
+        <w:rPr>
+          <w:color w:val="EE0000"/>
+        </w:rPr>
+        <w:t>indirektan</w:t>
+      </w:r>
+      <w:proofErr w:type="spellEnd"/>
+      <w:r>
+        <w:rPr>
+          <w:color w:val="EE0000"/>
+        </w:rPr>
+        <w:t xml:space="preserve"> </w:t>
+      </w:r>
+      <w:proofErr w:type="spellStart"/>
+      <w:r>
+        <w:rPr>
+          <w:color w:val="EE0000"/>
+        </w:rPr>
+        <w:t>poziv</w:t>
+      </w:r>
+      <w:proofErr w:type="spellEnd"/>
+      <w:r>
+        <w:rPr>
+          <w:color w:val="EE0000"/>
+        </w:rPr>
+        <w:t xml:space="preserve"> </w:t>
+      </w:r>
+      <w:proofErr w:type="spellStart"/>
+      <w:r>
+        <w:rPr>
+          <w:color w:val="EE0000"/>
+        </w:rPr>
+        <w:t>funkcije</w:t>
+      </w:r>
+      <w:proofErr w:type="spellEnd"/>
+      <w:r>
+        <w:rPr>
+          <w:color w:val="EE0000"/>
+        </w:rPr>
+        <w:t xml:space="preserve"> </w:t>
+      </w:r>
+      <w:proofErr w:type="spellStart"/>
+      <w:r>
+        <w:rPr>
+          <w:color w:val="EE0000"/>
+        </w:rPr>
+        <w:t>i</w:t>
+      </w:r>
+      <w:proofErr w:type="spellEnd"/>
+      <w:r>
+        <w:rPr>
+          <w:color w:val="EE0000"/>
+        </w:rPr>
+        <w:t xml:space="preserve"> </w:t>
+      </w:r>
+      <w:proofErr w:type="spellStart"/>
+      <w:r>
+        <w:rPr>
+          <w:color w:val="EE0000"/>
+        </w:rPr>
+        <w:t>jedan</w:t>
+      </w:r>
+      <w:proofErr w:type="spellEnd"/>
+      <w:r>
+        <w:rPr>
+          <w:color w:val="EE0000"/>
+        </w:rPr>
+        <w:t xml:space="preserve"> </w:t>
+      </w:r>
+      <w:proofErr w:type="spellStart"/>
+      <w:r>
+        <w:rPr>
+          <w:color w:val="EE0000"/>
+        </w:rPr>
+        <w:t>upis</w:t>
+      </w:r>
+      <w:proofErr w:type="spellEnd"/>
+      <w:r>
+        <w:rPr>
+          <w:color w:val="EE0000"/>
+        </w:rPr>
+        <w:t xml:space="preserve"> u </w:t>
+      </w:r>
+      <w:proofErr w:type="spellStart"/>
+      <w:r>
+        <w:rPr>
+          <w:color w:val="EE0000"/>
+        </w:rPr>
+        <w:t>memoriju</w:t>
+      </w:r>
+      <w:proofErr w:type="spellEnd"/>
+      <w:r>
+        <w:rPr>
+          <w:color w:val="EE0000"/>
+        </w:rPr>
+        <w:t xml:space="preserve">, </w:t>
+      </w:r>
+      <w:proofErr w:type="spellStart"/>
+      <w:r>
+        <w:rPr>
+          <w:color w:val="EE0000"/>
+        </w:rPr>
+        <w:t>samo</w:t>
+      </w:r>
+      <w:proofErr w:type="spellEnd"/>
+      <w:r>
+        <w:rPr>
+          <w:color w:val="EE0000"/>
+        </w:rPr>
+        <w:t xml:space="preserve"> se </w:t>
+      </w:r>
+      <w:proofErr w:type="spellStart"/>
+      <w:r>
+        <w:rPr>
+          <w:color w:val="EE0000"/>
+        </w:rPr>
+        <w:t>razlikuje</w:t>
+      </w:r>
+      <w:proofErr w:type="spellEnd"/>
+      <w:r>
+        <w:rPr>
+          <w:color w:val="EE0000"/>
+        </w:rPr>
+        <w:t xml:space="preserve"> </w:t>
+      </w:r>
+      <w:proofErr w:type="spellStart"/>
+      <w:r>
+        <w:rPr>
+          <w:color w:val="EE0000"/>
+        </w:rPr>
+        <w:t>redosled</w:t>
+      </w:r>
+      <w:proofErr w:type="spellEnd"/>
+      <w:r>
+        <w:rPr>
+          <w:color w:val="EE0000"/>
+        </w:rPr>
+        <w:t xml:space="preserve">/put </w:t>
+      </w:r>
+      <w:proofErr w:type="spellStart"/>
+      <w:r>
+        <w:rPr>
+          <w:color w:val="EE0000"/>
+        </w:rPr>
+        <w:t>kojim</w:t>
+      </w:r>
+      <w:proofErr w:type="spellEnd"/>
+      <w:r>
+        <w:rPr>
+          <w:color w:val="EE0000"/>
+        </w:rPr>
+        <w:t xml:space="preserve"> ta </w:t>
+      </w:r>
+      <w:proofErr w:type="spellStart"/>
+      <w:r>
+        <w:rPr>
+          <w:color w:val="EE0000"/>
+        </w:rPr>
+        <w:t>vrednost</w:t>
+      </w:r>
+      <w:proofErr w:type="spellEnd"/>
+      <w:r>
+        <w:rPr>
+          <w:color w:val="EE0000"/>
+        </w:rPr>
+        <w:t xml:space="preserve"> </w:t>
+      </w:r>
+      <w:proofErr w:type="spellStart"/>
+      <w:r>
+        <w:rPr>
+          <w:color w:val="EE0000"/>
+        </w:rPr>
+        <w:t>stiže</w:t>
+      </w:r>
+      <w:proofErr w:type="spellEnd"/>
+      <w:r>
+        <w:rPr>
+          <w:color w:val="EE0000"/>
+        </w:rPr>
+        <w:t xml:space="preserve"> do </w:t>
+      </w:r>
+      <w:proofErr w:type="spellStart"/>
+      <w:r>
+        <w:rPr>
+          <w:color w:val="EE0000"/>
+        </w:rPr>
+        <w:t>current_state</w:t>
+      </w:r>
+      <w:proofErr w:type="spellEnd"/>
+      <w:r>
+        <w:rPr>
+          <w:color w:val="EE0000"/>
+        </w:rPr>
+        <w:t xml:space="preserve">. Ako se ova </w:t>
+      </w:r>
+      <w:proofErr w:type="spellStart"/>
+      <w:r>
+        <w:rPr>
+          <w:color w:val="EE0000"/>
+        </w:rPr>
+        <w:t>predikcija</w:t>
+      </w:r>
+      <w:proofErr w:type="spellEnd"/>
+      <w:r>
+        <w:rPr>
+          <w:color w:val="EE0000"/>
+        </w:rPr>
+        <w:t xml:space="preserve"> </w:t>
+      </w:r>
+      <w:proofErr w:type="spellStart"/>
+      <w:r>
+        <w:rPr>
+          <w:color w:val="EE0000"/>
+        </w:rPr>
+        <w:t>potvrdi</w:t>
+      </w:r>
+      <w:proofErr w:type="spellEnd"/>
+      <w:r>
+        <w:rPr>
+          <w:color w:val="EE0000"/>
+        </w:rPr>
+        <w:t xml:space="preserve">, </w:t>
+      </w:r>
+      <w:proofErr w:type="spellStart"/>
+      <w:r>
+        <w:rPr>
+          <w:color w:val="EE0000"/>
+        </w:rPr>
+        <w:t>rezultat</w:t>
+      </w:r>
+      <w:proofErr w:type="spellEnd"/>
+      <w:r>
+        <w:rPr>
+          <w:color w:val="EE0000"/>
+        </w:rPr>
+        <w:t xml:space="preserve"> </w:t>
+      </w:r>
+      <w:proofErr w:type="spellStart"/>
+      <w:r>
+        <w:rPr>
+          <w:color w:val="EE0000"/>
+        </w:rPr>
+        <w:t>razgraničava</w:t>
+      </w:r>
+      <w:proofErr w:type="spellEnd"/>
+      <w:r>
+        <w:rPr>
+          <w:color w:val="EE0000"/>
+        </w:rPr>
+        <w:t xml:space="preserve"> </w:t>
+      </w:r>
+      <w:proofErr w:type="spellStart"/>
+      <w:r>
+        <w:rPr>
+          <w:color w:val="EE0000"/>
+        </w:rPr>
+        <w:t>dva</w:t>
+      </w:r>
+      <w:proofErr w:type="spellEnd"/>
+      <w:r>
+        <w:rPr>
+          <w:color w:val="EE0000"/>
+        </w:rPr>
+        <w:t xml:space="preserve"> </w:t>
+      </w:r>
+      <w:proofErr w:type="spellStart"/>
+      <w:r>
+        <w:rPr>
+          <w:color w:val="EE0000"/>
+        </w:rPr>
+        <w:t>prethodno</w:t>
+      </w:r>
+      <w:proofErr w:type="spellEnd"/>
+      <w:r>
+        <w:rPr>
+          <w:color w:val="EE0000"/>
+        </w:rPr>
+        <w:t xml:space="preserve"> </w:t>
+      </w:r>
+      <w:proofErr w:type="spellStart"/>
+      <w:r>
+        <w:rPr>
+          <w:color w:val="EE0000"/>
+        </w:rPr>
+        <w:t>pomešana</w:t>
+      </w:r>
+      <w:proofErr w:type="spellEnd"/>
+      <w:r>
+        <w:rPr>
+          <w:color w:val="EE0000"/>
+        </w:rPr>
+        <w:t xml:space="preserve"> </w:t>
+      </w:r>
+      <w:proofErr w:type="spellStart"/>
+      <w:r>
+        <w:rPr>
+          <w:color w:val="EE0000"/>
+        </w:rPr>
+        <w:t>faktora</w:t>
+      </w:r>
+      <w:proofErr w:type="spellEnd"/>
+      <w:r>
+        <w:rPr>
+          <w:color w:val="EE0000"/>
+        </w:rPr>
+        <w:t xml:space="preserve"> u </w:t>
+      </w:r>
+      <w:proofErr w:type="spellStart"/>
+      <w:r>
+        <w:rPr>
+          <w:color w:val="EE0000"/>
+        </w:rPr>
+        <w:t>ovom</w:t>
+      </w:r>
+      <w:proofErr w:type="spellEnd"/>
+      <w:r>
+        <w:rPr>
+          <w:color w:val="EE0000"/>
+        </w:rPr>
+        <w:t xml:space="preserve"> </w:t>
+      </w:r>
+      <w:proofErr w:type="spellStart"/>
+      <w:r>
+        <w:rPr>
+          <w:color w:val="EE0000"/>
+        </w:rPr>
+        <w:t>radu</w:t>
+      </w:r>
+      <w:proofErr w:type="spellEnd"/>
+      <w:r>
+        <w:rPr>
+          <w:color w:val="EE0000"/>
+        </w:rPr>
+        <w:t xml:space="preserve"> — </w:t>
+      </w:r>
+      <w:proofErr w:type="spellStart"/>
+      <w:r>
+        <w:rPr>
+          <w:color w:val="EE0000"/>
+        </w:rPr>
+        <w:t>trošak</w:t>
+      </w:r>
+      <w:proofErr w:type="spellEnd"/>
+      <w:r>
+        <w:rPr>
+          <w:color w:val="EE0000"/>
+        </w:rPr>
+        <w:t xml:space="preserve"> </w:t>
+      </w:r>
+      <w:proofErr w:type="spellStart"/>
+      <w:r>
+        <w:rPr>
+          <w:b/>
+          <w:bCs/>
+          <w:color w:val="EE0000"/>
+        </w:rPr>
+        <w:t>broja</w:t>
+      </w:r>
+      <w:proofErr w:type="spellEnd"/>
+      <w:r>
+        <w:rPr>
+          <w:color w:val="EE0000"/>
+        </w:rPr>
+        <w:t xml:space="preserve"> </w:t>
+      </w:r>
+      <w:proofErr w:type="spellStart"/>
+      <w:r>
+        <w:rPr>
+          <w:color w:val="EE0000"/>
+        </w:rPr>
+        <w:t>indirekcija</w:t>
+      </w:r>
+      <w:proofErr w:type="spellEnd"/>
+      <w:r>
+        <w:rPr>
+          <w:color w:val="EE0000"/>
+        </w:rPr>
+        <w:t xml:space="preserve"> (</w:t>
+      </w:r>
+      <w:proofErr w:type="spellStart"/>
+      <w:r>
+        <w:rPr>
+          <w:color w:val="EE0000"/>
+        </w:rPr>
+        <w:t>već</w:t>
+      </w:r>
+      <w:proofErr w:type="spellEnd"/>
+      <w:r>
+        <w:rPr>
+          <w:color w:val="EE0000"/>
+        </w:rPr>
+        <w:t xml:space="preserve"> </w:t>
+      </w:r>
+      <w:proofErr w:type="spellStart"/>
+      <w:r>
+        <w:rPr>
+          <w:color w:val="EE0000"/>
+        </w:rPr>
+        <w:t>utvrđen</w:t>
+      </w:r>
+      <w:proofErr w:type="spellEnd"/>
+      <w:r>
+        <w:rPr>
+          <w:color w:val="EE0000"/>
+        </w:rPr>
+        <w:t xml:space="preserve"> </w:t>
+      </w:r>
+      <w:proofErr w:type="spellStart"/>
+      <w:r>
+        <w:rPr>
+          <w:color w:val="EE0000"/>
+        </w:rPr>
+        <w:t>kroz</w:t>
+      </w:r>
+      <w:proofErr w:type="spellEnd"/>
+      <w:r>
+        <w:rPr>
+          <w:color w:val="EE0000"/>
+        </w:rPr>
+        <w:t xml:space="preserve"> </w:t>
+      </w:r>
+      <w:proofErr w:type="spellStart"/>
+      <w:r>
+        <w:rPr>
+          <w:color w:val="EE0000"/>
+        </w:rPr>
+        <w:t>poređenja</w:t>
+      </w:r>
+      <w:proofErr w:type="spellEnd"/>
+      <w:r>
+        <w:rPr>
+          <w:color w:val="EE0000"/>
+        </w:rPr>
+        <w:t xml:space="preserve"> </w:t>
+      </w:r>
+      <w:proofErr w:type="spellStart"/>
+      <w:r>
+        <w:rPr>
+          <w:color w:val="EE0000"/>
+        </w:rPr>
+        <w:t>sa</w:t>
+      </w:r>
+      <w:proofErr w:type="spellEnd"/>
+      <w:r>
+        <w:rPr>
+          <w:color w:val="EE0000"/>
+        </w:rPr>
+        <w:t xml:space="preserve"> Indexed Table) od </w:t>
+      </w:r>
+      <w:proofErr w:type="spellStart"/>
+      <w:r>
+        <w:rPr>
+          <w:color w:val="EE0000"/>
+        </w:rPr>
+        <w:t>troška</w:t>
+      </w:r>
+      <w:proofErr w:type="spellEnd"/>
+      <w:r>
+        <w:rPr>
+          <w:color w:val="EE0000"/>
+        </w:rPr>
+        <w:t xml:space="preserve"> </w:t>
+      </w:r>
+      <w:proofErr w:type="spellStart"/>
+      <w:r>
+        <w:rPr>
+          <w:b/>
+          <w:bCs/>
+          <w:color w:val="EE0000"/>
+        </w:rPr>
+        <w:t>stila</w:t>
+      </w:r>
+      <w:proofErr w:type="spellEnd"/>
+      <w:r>
+        <w:rPr>
+          <w:b/>
+          <w:bCs/>
+          <w:color w:val="EE0000"/>
+        </w:rPr>
+        <w:t xml:space="preserve"> </w:t>
+      </w:r>
+      <w:proofErr w:type="spellStart"/>
+      <w:r>
+        <w:rPr>
+          <w:b/>
+          <w:bCs/>
+          <w:color w:val="EE0000"/>
+        </w:rPr>
+        <w:t>prenosa</w:t>
+      </w:r>
+      <w:proofErr w:type="spellEnd"/>
+      <w:r>
+        <w:rPr>
+          <w:color w:val="EE0000"/>
+        </w:rPr>
+        <w:t xml:space="preserve"> </w:t>
+      </w:r>
+      <w:proofErr w:type="spellStart"/>
+      <w:r>
+        <w:rPr>
+          <w:color w:val="EE0000"/>
+        </w:rPr>
+        <w:t>rezultata</w:t>
+      </w:r>
+      <w:proofErr w:type="spellEnd"/>
+      <w:r>
+        <w:rPr>
+          <w:color w:val="EE0000"/>
+        </w:rPr>
+        <w:t xml:space="preserve"> (koji bi se </w:t>
+      </w:r>
+      <w:proofErr w:type="spellStart"/>
+      <w:r>
+        <w:rPr>
+          <w:color w:val="EE0000"/>
+        </w:rPr>
+        <w:t>ovim</w:t>
+      </w:r>
+      <w:proofErr w:type="spellEnd"/>
+      <w:r>
+        <w:rPr>
+          <w:color w:val="EE0000"/>
+        </w:rPr>
+        <w:t xml:space="preserve"> </w:t>
+      </w:r>
+      <w:proofErr w:type="spellStart"/>
+      <w:r>
+        <w:rPr>
+          <w:color w:val="EE0000"/>
+        </w:rPr>
+        <w:t>poređenjem</w:t>
+      </w:r>
+      <w:proofErr w:type="spellEnd"/>
+      <w:r>
+        <w:rPr>
+          <w:color w:val="EE0000"/>
+        </w:rPr>
+        <w:t xml:space="preserve"> po </w:t>
+      </w:r>
+      <w:proofErr w:type="spellStart"/>
+      <w:r>
+        <w:rPr>
+          <w:color w:val="EE0000"/>
+        </w:rPr>
+        <w:t>prvi</w:t>
+      </w:r>
+      <w:proofErr w:type="spellEnd"/>
+      <w:r>
+        <w:rPr>
+          <w:color w:val="EE0000"/>
+        </w:rPr>
+        <w:t xml:space="preserve"> put </w:t>
+      </w:r>
+      <w:proofErr w:type="spellStart"/>
+      <w:r>
+        <w:rPr>
+          <w:color w:val="EE0000"/>
+        </w:rPr>
+        <w:t>izolovano</w:t>
+      </w:r>
+      <w:proofErr w:type="spellEnd"/>
+      <w:r>
+        <w:rPr>
+          <w:color w:val="EE0000"/>
+        </w:rPr>
+        <w:t xml:space="preserve"> </w:t>
+      </w:r>
+      <w:proofErr w:type="spellStart"/>
+      <w:r>
+        <w:rPr>
+          <w:color w:val="EE0000"/>
+        </w:rPr>
+        <w:t>proverio</w:t>
+      </w:r>
+      <w:proofErr w:type="spellEnd"/>
+      <w:r>
+        <w:rPr>
+          <w:color w:val="EE0000"/>
+        </w:rPr>
+        <w:t>).</w:t>
+      </w:r>
+    </w:p>
     <w:p/>
     <w:sectPr>
       <w:pgSz w:w="12240" w:h="15840"/>
@@ -13478,6 +16189,100 @@
     </w:sectPr>
   </w:body>
 </w:document>
+</file>
+
+<file path=word/numbering.xml><?xml version="1.0" encoding="utf-8"?>
+<w:numbering xmlns:wpc="http://schemas.microsoft.com/office/word/2010/wordprocessingCanvas" xmlns:cx="http://schemas.microsoft.com/office/drawing/2014/chartex" xmlns:cx1="http://schemas.microsoft.com/office/drawing/2015/9/8/chartex" xmlns:cx2="http://schemas.microsoft.com/office/drawing/2015/10/21/chartex" xmlns:cx3="http://schemas.microsoft.com/office/drawing/2016/5/9/chartex" xmlns:cx4="http://schemas.microsoft.com/office/drawing/2016/5/10/chartex" xmlns:cx5="http://schemas.microsoft.com/office/drawing/2016/5/11/chartex" xmlns:cx6="http://schemas.microsoft.com/office/drawing/2016/5/12/chartex" xmlns:cx7="http://schemas.microsoft.com/office/drawing/2016/5/13/chartex" xmlns:cx8="http://schemas.microsoft.com/office/drawing/2016/5/14/chartex" xmlns:mc="http://schemas.openxmlformats.org/markup-compatibility/2006" xmlns:aink="http://schemas.microsoft.com/office/drawing/2016/ink" xmlns:am3d="http://schemas.microsoft.com/office/drawing/2017/model3d" xmlns:o="urn:schemas-microsoft-com:office:office" xmlns:oel="http://schemas.microsoft.com/office/2019/extlst" xmlns:r="http://schemas.openxmlformats.org/officeDocument/2006/relationships" xmlns:m="http://schemas.openxmlformats.org/officeDocument/2006/math" xmlns:v="urn:schemas-microsoft-com:vml" xmlns:wp14="http://schemas.microsoft.com/office/word/2010/wordprocessingDrawing" xmlns:wp="http://schemas.openxmlformats.org/drawingml/2006/wordprocessingDrawing" xmlns:w10="urn:schemas-microsoft-com:office:word" xmlns:w="http://schemas.openxmlformats.org/wordprocessingml/2006/main" xmlns:w14="http://schemas.microsoft.com/office/word/2010/wordml" xmlns:w15="http://schemas.microsoft.com/office/word/2012/wordml" xmlns:w16cex="http://schemas.microsoft.com/office/word/2018/wordml/cex" xmlns:w16cid="http://schemas.microsoft.com/office/word/2016/wordml/cid" xmlns:w16="http://schemas.microsoft.com/office/word/2018/wordml" xmlns:w16du="http://schemas.microsoft.com/office/word/2023/wordml/word16du" xmlns:w16sdtdh="http://schemas.microsoft.com/office/word/2020/wordml/sdtdatahash" xmlns:w16sdtfl="http://schemas.microsoft.com/office/word/2024/wordml/sdtformatlock" xmlns:w16se="http://schemas.microsoft.com/office/word/2015/wordml/symex" xmlns:wpg="http://schemas.microsoft.com/office/word/2010/wordprocessingGroup" xmlns:wpi="http://schemas.microsoft.com/office/word/2010/wordprocessingInk" xmlns:wne="http://schemas.microsoft.com/office/word/2006/wordml" xmlns:wps="http://schemas.microsoft.com/office/word/2010/wordprocessingShape" mc:Ignorable="w14 w15 w16se w16cid w16 w16cex w16sdtdh w16sdtfl w16du wp14">
+  <w:abstractNum w:abstractNumId="0" w15:restartNumberingAfterBreak="0">
+    <w:nsid w:val="36AD5A4C"/>
+    <w:multiLevelType w:val="hybridMultilevel"/>
+    <w:tmpl w:val="A6FCB48A"/>
+    <w:lvl w:ilvl="0" w:tplc="0409000F">
+      <w:start w:val="1"/>
+      <w:numFmt w:val="decimal"/>
+      <w:lvlText w:val="%1."/>
+      <w:lvlJc w:val="left"/>
+      <w:pPr>
+        <w:ind w:left="720" w:hanging="360"/>
+      </w:pPr>
+    </w:lvl>
+    <w:lvl w:ilvl="1" w:tplc="04090019" w:tentative="1">
+      <w:start w:val="1"/>
+      <w:numFmt w:val="lowerLetter"/>
+      <w:lvlText w:val="%2."/>
+      <w:lvlJc w:val="left"/>
+      <w:pPr>
+        <w:ind w:left="1440" w:hanging="360"/>
+      </w:pPr>
+    </w:lvl>
+    <w:lvl w:ilvl="2" w:tplc="0409001B" w:tentative="1">
+      <w:start w:val="1"/>
+      <w:numFmt w:val="lowerRoman"/>
+      <w:lvlText w:val="%3."/>
+      <w:lvlJc w:val="right"/>
+      <w:pPr>
+        <w:ind w:left="2160" w:hanging="180"/>
+      </w:pPr>
+    </w:lvl>
+    <w:lvl w:ilvl="3" w:tplc="0409000F" w:tentative="1">
+      <w:start w:val="1"/>
+      <w:numFmt w:val="decimal"/>
+      <w:lvlText w:val="%4."/>
+      <w:lvlJc w:val="left"/>
+      <w:pPr>
+        <w:ind w:left="2880" w:hanging="360"/>
+      </w:pPr>
+    </w:lvl>
+    <w:lvl w:ilvl="4" w:tplc="04090019" w:tentative="1">
+      <w:start w:val="1"/>
+      <w:numFmt w:val="lowerLetter"/>
+      <w:lvlText w:val="%5."/>
+      <w:lvlJc w:val="left"/>
+      <w:pPr>
+        <w:ind w:left="3600" w:hanging="360"/>
+      </w:pPr>
+    </w:lvl>
+    <w:lvl w:ilvl="5" w:tplc="0409001B" w:tentative="1">
+      <w:start w:val="1"/>
+      <w:numFmt w:val="lowerRoman"/>
+      <w:lvlText w:val="%6."/>
+      <w:lvlJc w:val="right"/>
+      <w:pPr>
+        <w:ind w:left="4320" w:hanging="180"/>
+      </w:pPr>
+    </w:lvl>
+    <w:lvl w:ilvl="6" w:tplc="0409000F" w:tentative="1">
+      <w:start w:val="1"/>
+      <w:numFmt w:val="decimal"/>
+      <w:lvlText w:val="%7."/>
+      <w:lvlJc w:val="left"/>
+      <w:pPr>
+        <w:ind w:left="5040" w:hanging="360"/>
+      </w:pPr>
+    </w:lvl>
+    <w:lvl w:ilvl="7" w:tplc="04090019" w:tentative="1">
+      <w:start w:val="1"/>
+      <w:numFmt w:val="lowerLetter"/>
+      <w:lvlText w:val="%8."/>
+      <w:lvlJc w:val="left"/>
+      <w:pPr>
+        <w:ind w:left="5760" w:hanging="360"/>
+      </w:pPr>
+    </w:lvl>
+    <w:lvl w:ilvl="8" w:tplc="0409001B" w:tentative="1">
+      <w:start w:val="1"/>
+      <w:numFmt w:val="lowerRoman"/>
+      <w:lvlText w:val="%9."/>
+      <w:lvlJc w:val="right"/>
+      <w:pPr>
+        <w:ind w:left="6480" w:hanging="180"/>
+      </w:pPr>
+    </w:lvl>
+  </w:abstractNum>
+  <w:num w:numId="1" w16cid:durableId="1280991096">
+    <w:abstractNumId w:val="0"/>
+  </w:num>
+</w:numbering>
 </file>
 
 <file path=word/styles.xml><?xml version="1.0" encoding="utf-8"?>

</xml_diff>